<commit_message>
Split dbt run/test into layered staging and marts tasks
Each dbt layer is now tested immediately after it is built:
dbt_run_staging -> dbt_test_staging -> dbt_run_marts -> dbt_test_marts.
A failed staging test stops the marts from being built.

Also moves the documentation PDF into docs/ and updates the Word
document, README and DOCUMENTATION.md to the new 7-task flow.

Co-Authored-By: Claude Opus 5.5 <noreply@anthropic.com>
</commit_message>
<xml_diff>
--- a/docs/Superstore_DWH_Documentation.docx
+++ b/docs/Superstore_DWH_Documentation.docx
@@ -2,10 +2,7 @@
 <file path=word/document.xml><?xml version="1.0" encoding="utf-8"?>
 <w:document xmlns:wpc="http://schemas.microsoft.com/office/word/2010/wordprocessingCanvas" xmlns:cx="http://schemas.microsoft.com/office/drawing/2014/chartex" xmlns:cx1="http://schemas.microsoft.com/office/drawing/2015/9/8/chartex" xmlns:cx2="http://schemas.microsoft.com/office/drawing/2015/10/21/chartex" xmlns:cx3="http://schemas.microsoft.com/office/drawing/2016/5/9/chartex" xmlns:cx4="http://schemas.microsoft.com/office/drawing/2016/5/10/chartex" xmlns:cx5="http://schemas.microsoft.com/office/drawing/2016/5/11/chartex" xmlns:cx6="http://schemas.microsoft.com/office/drawing/2016/5/12/chartex" xmlns:cx7="http://schemas.microsoft.com/office/drawing/2016/5/13/chartex" xmlns:cx8="http://schemas.microsoft.com/office/drawing/2016/5/14/chartex" xmlns:mc="http://schemas.openxmlformats.org/markup-compatibility/2006" xmlns:aink="http://schemas.microsoft.com/office/drawing/2016/ink" xmlns:am3d="http://schemas.microsoft.com/office/drawing/2017/model3d" xmlns:o="urn:schemas-microsoft-com:office:office" xmlns:r="http://schemas.openxmlformats.org/officeDocument/2006/relationships" xmlns:m="http://schemas.openxmlformats.org/officeDocument/2006/math" xmlns:v="urn:schemas-microsoft-com:vml" xmlns:wp14="http://schemas.microsoft.com/office/word/2010/wordprocessingDrawing" xmlns:wp="http://schemas.openxmlformats.org/drawingml/2006/wordprocessingDrawing" xmlns:w10="urn:schemas-microsoft-com:office:word" xmlns:w="http://schemas.openxmlformats.org/wordprocessingml/2006/main" xmlns:w14="http://schemas.microsoft.com/office/word/2010/wordml" xmlns:w15="http://schemas.microsoft.com/office/word/2012/wordml" xmlns:w16cid="http://schemas.microsoft.com/office/word/2016/wordml/cid" xmlns:w16se="http://schemas.microsoft.com/office/word/2015/wordml/symex" xmlns:wpg="http://schemas.microsoft.com/office/word/2010/wordprocessingGroup" xmlns:wpi="http://schemas.microsoft.com/office/word/2010/wordprocessingInk" xmlns:wne="http://schemas.microsoft.com/office/word/2006/wordml" xmlns:wps="http://schemas.microsoft.com/office/word/2010/wordprocessingShape" mc:Ignorable="w14 w15 w16se w16cid wp14">
   <w:body>
-    <w:p>
-      <w:bookmarkStart w:id="0" w:name="_GoBack"/>
-      <w:bookmarkEnd w:id="0"/>
-    </w:p>
+    <w:p/>
     <w:p/>
     <w:p/>
     <w:p/>
@@ -46,8 +43,33 @@
           <w:color w:val="595959"/>
           <w:sz w:val="30"/>
         </w:rPr>
-        <w:t>Batch ELT pipeline with Apache Airflow, dbt and DuckDB</w:t>
-      </w:r>
+        <w:t xml:space="preserve">Batch ELT pipeline with Apache Airflow, </w:t>
+      </w:r>
+      <w:proofErr w:type="spellStart"/>
+      <w:r>
+        <w:rPr>
+          <w:color w:val="595959"/>
+          <w:sz w:val="30"/>
+        </w:rPr>
+        <w:t>dbt</w:t>
+      </w:r>
+      <w:proofErr w:type="spellEnd"/>
+      <w:r>
+        <w:rPr>
+          <w:color w:val="595959"/>
+          <w:sz w:val="30"/>
+        </w:rPr>
+        <w:t xml:space="preserve"> and </w:t>
+      </w:r>
+      <w:proofErr w:type="spellStart"/>
+      <w:r>
+        <w:rPr>
+          <w:color w:val="595959"/>
+          <w:sz w:val="30"/>
+        </w:rPr>
+        <w:t>DuckDB</w:t>
+      </w:r>
+      <w:proofErr w:type="spellEnd"/>
     </w:p>
     <w:p/>
     <w:p/>
@@ -78,8 +100,13 @@
         </w:rPr>
         <w:t xml:space="preserve">Program:  </w:t>
       </w:r>
-      <w:r>
-        <w:t>DataOps Engineering, NTI</w:t>
+      <w:proofErr w:type="spellStart"/>
+      <w:r>
+        <w:t>DataOps</w:t>
+      </w:r>
+      <w:proofErr w:type="spellEnd"/>
+      <w:r>
+        <w:t xml:space="preserve"> Engineering, NTI</w:t>
       </w:r>
     </w:p>
     <w:p>
@@ -100,23 +127,31 @@
     <w:p>
       <w:pPr>
         <w:spacing w:after="40"/>
+        <w:rPr>
+          <w:sz w:val="20"/>
+          <w:szCs w:val="20"/>
+        </w:rPr>
       </w:pPr>
       <w:r>
         <w:rPr>
           <w:b/>
           <w:color w:val="1F3A5F"/>
+          <w:sz w:val="20"/>
+          <w:szCs w:val="20"/>
         </w:rPr>
         <w:t xml:space="preserve">Repository:  </w:t>
       </w:r>
-      <w:hyperlink r:id="rId8">
-        <w:r>
-          <w:rPr>
-            <w:color w:val="2E75B6"/>
-            <w:u w:val="single"/>
-          </w:rPr>
-          <w:t>github.com/MinaMiladd/Superstore-Data-Warehouse-Airflow-dbt-DuckDB</w:t>
-        </w:r>
-      </w:hyperlink>
+      <w:bookmarkStart w:id="0" w:name="_GoBack"/>
+      <w:r>
+        <w:rPr>
+          <w:b/>
+          <w:color w:val="1F3A5F"/>
+          <w:sz w:val="20"/>
+          <w:szCs w:val="20"/>
+        </w:rPr>
+        <w:t>https://github.com/MinaMiladd/MinaMiladd-Superstore_Data_Warehouse_Airflow_dbt_DuckDB.git</w:t>
+      </w:r>
+      <w:bookmarkEnd w:id="0"/>
     </w:p>
     <w:p/>
     <w:p/>
@@ -128,7 +163,55 @@
           <w:color w:val="595959"/>
           <w:sz w:val="20"/>
         </w:rPr>
-        <w:t>Stack:  Apache Airflow 3.1  ·  dbt-core 1.12  ·  DuckDB 1.5  ·  Python 3.11  ·  Docker</w:t>
+        <w:t xml:space="preserve">Stack:  Apache Airflow </w:t>
+      </w:r>
+      <w:proofErr w:type="gramStart"/>
+      <w:r>
+        <w:rPr>
+          <w:color w:val="595959"/>
+          <w:sz w:val="20"/>
+        </w:rPr>
+        <w:t>3.1  ·</w:t>
+      </w:r>
+      <w:proofErr w:type="gramEnd"/>
+      <w:r>
+        <w:rPr>
+          <w:color w:val="595959"/>
+          <w:sz w:val="20"/>
+        </w:rPr>
+        <w:t xml:space="preserve">  </w:t>
+      </w:r>
+      <w:proofErr w:type="spellStart"/>
+      <w:r>
+        <w:rPr>
+          <w:color w:val="595959"/>
+          <w:sz w:val="20"/>
+        </w:rPr>
+        <w:t>dbt</w:t>
+      </w:r>
+      <w:proofErr w:type="spellEnd"/>
+      <w:r>
+        <w:rPr>
+          <w:color w:val="595959"/>
+          <w:sz w:val="20"/>
+        </w:rPr>
+        <w:t xml:space="preserve">-core 1.12  ·  </w:t>
+      </w:r>
+      <w:proofErr w:type="spellStart"/>
+      <w:r>
+        <w:rPr>
+          <w:color w:val="595959"/>
+          <w:sz w:val="20"/>
+        </w:rPr>
+        <w:t>DuckDB</w:t>
+      </w:r>
+      <w:proofErr w:type="spellEnd"/>
+      <w:r>
+        <w:rPr>
+          <w:color w:val="595959"/>
+          <w:sz w:val="20"/>
+        </w:rPr>
+        <w:t xml:space="preserve"> 1.5  ·  Python 3.11  ·  Docker</w:t>
       </w:r>
     </w:p>
     <w:p>
@@ -144,15 +227,7 @@
           <w:sz w:val="36"/>
         </w:rPr>
         <w:lastRenderedPageBreak/>
-        <w:t>Cont</w:t>
-      </w:r>
-      <w:r>
-        <w:rPr>
-          <w:b/>
-          <w:color w:val="1F3A5F"/>
-          <w:sz w:val="36"/>
-        </w:rPr>
-        <w:t>ents</w:t>
+        <w:t>Contents</w:t>
       </w:r>
     </w:p>
     <w:p>
@@ -1940,7 +2015,7 @@
     <w:p>
       <w:pPr>
         <w:sectPr>
-          <w:headerReference w:type="default" r:id="rId9"/>
+          <w:headerReference w:type="default" r:id="rId8"/>
           <w:pgSz w:w="11906" w:h="16838"/>
           <w:pgMar w:top="1247" w:right="1134" w:bottom="1134" w:left="1134" w:header="720" w:footer="720" w:gutter="0"/>
           <w:cols w:space="720"/>
@@ -1961,13 +2036,7 @@
           <w:sz w:val="20"/>
         </w:rPr>
         <w:lastRenderedPageBreak/>
-        <w:t xml:space="preserve">This document covers the internals of the project: data lineage, the data dictionary, transformation logic, orchestration, testing, </w:t>
-      </w:r>
-      <w:r>
-        <w:rPr>
-          <w:sz w:val="20"/>
-        </w:rPr>
-        <w:t>operations and known limitations. For a quick overview and setup, see the README on GitHub.</w:t>
+        <w:t>This document covers the internals of the project: data lineage, the data dictionary, transformation logic, orchestration, testing, operations and known limitations. For a quick overview and setup, see the README on GitHub.</w:t>
       </w:r>
     </w:p>
     <w:p>
@@ -2162,17 +2231,33 @@
               <w:keepNext/>
               <w:spacing w:before="40" w:after="40"/>
             </w:pPr>
-            <w:r>
-              <w:rPr>
-                <w:sz w:val="18"/>
-              </w:rPr>
-              <w:t xml:space="preserve">dbt-core 1.12.5 with </w:t>
-            </w:r>
-            <w:r>
-              <w:rPr>
-                <w:sz w:val="18"/>
-              </w:rPr>
-              <w:t>dbt-duckdb 1.11.0</w:t>
+            <w:proofErr w:type="spellStart"/>
+            <w:r>
+              <w:rPr>
+                <w:sz w:val="18"/>
+              </w:rPr>
+              <w:t>dbt</w:t>
+            </w:r>
+            <w:proofErr w:type="spellEnd"/>
+            <w:r>
+              <w:rPr>
+                <w:sz w:val="18"/>
+              </w:rPr>
+              <w:t xml:space="preserve">-core 1.12.5 with </w:t>
+            </w:r>
+            <w:proofErr w:type="spellStart"/>
+            <w:r>
+              <w:rPr>
+                <w:sz w:val="18"/>
+              </w:rPr>
+              <w:t>dbt-duckdb</w:t>
+            </w:r>
+            <w:proofErr w:type="spellEnd"/>
+            <w:r>
+              <w:rPr>
+                <w:sz w:val="18"/>
+              </w:rPr>
+              <w:t xml:space="preserve"> 1.11.0</w:t>
             </w:r>
           </w:p>
         </w:tc>
@@ -2210,20 +2295,48 @@
               <w:keepNext/>
               <w:spacing w:before="40" w:after="40"/>
             </w:pPr>
-            <w:r>
-              <w:rPr>
-                <w:sz w:val="18"/>
-              </w:rPr>
-              <w:t>DuckDB 1.5.6, a single embedded file (</w:t>
-            </w:r>
+            <w:proofErr w:type="spellStart"/>
+            <w:r>
+              <w:rPr>
+                <w:sz w:val="18"/>
+              </w:rPr>
+              <w:t>DuckDB</w:t>
+            </w:r>
+            <w:proofErr w:type="spellEnd"/>
+            <w:r>
+              <w:rPr>
+                <w:sz w:val="18"/>
+              </w:rPr>
+              <w:t xml:space="preserve"> 1.5.6, a single embedded file (</w:t>
+            </w:r>
+            <w:proofErr w:type="spellStart"/>
             <w:r>
               <w:rPr>
                 <w:rFonts w:ascii="Consolas" w:hAnsi="Consolas"/>
                 <w:color w:val="C7254E"/>
                 <w:sz w:val="16"/>
               </w:rPr>
-              <w:t>my_project/dev.duckdb</w:t>
-            </w:r>
+              <w:t>my_project</w:t>
+            </w:r>
+            <w:proofErr w:type="spellEnd"/>
+            <w:r>
+              <w:rPr>
+                <w:rFonts w:ascii="Consolas" w:hAnsi="Consolas"/>
+                <w:color w:val="C7254E"/>
+                <w:sz w:val="16"/>
+              </w:rPr>
+              <w:t>/</w:t>
+            </w:r>
+            <w:proofErr w:type="spellStart"/>
+            <w:r>
+              <w:rPr>
+                <w:rFonts w:ascii="Consolas" w:hAnsi="Consolas"/>
+                <w:color w:val="C7254E"/>
+                <w:sz w:val="16"/>
+              </w:rPr>
+              <w:t>dev.duckdb</w:t>
+            </w:r>
+            <w:proofErr w:type="spellEnd"/>
             <w:r>
               <w:rPr>
                 <w:sz w:val="18"/>
@@ -2801,7 +2914,15 @@
         <w:t>Product Name</w:t>
       </w:r>
       <w:r>
-        <w:t>. The data model works around this (see dim_product).</w:t>
+        <w:t xml:space="preserve">. The data model works around this (see </w:t>
+      </w:r>
+      <w:proofErr w:type="spellStart"/>
+      <w:r>
+        <w:t>dim_product</w:t>
+      </w:r>
+      <w:proofErr w:type="spellEnd"/>
+      <w:r>
+        <w:t>).</w:t>
       </w:r>
     </w:p>
     <w:p>
@@ -2855,7 +2976,61 @@
           <w:color w:val="24292E"/>
           <w:sz w:val="17"/>
         </w:rPr>
-        <w:t xml:space="preserve">      │  load_to_ods.py  (DuckDB read_xlsx)</w:t>
+        <w:t xml:space="preserve">      </w:t>
+      </w:r>
+      <w:proofErr w:type="gramStart"/>
+      <w:r>
+        <w:rPr>
+          <w:rFonts w:ascii="Consolas" w:eastAsia="Consolas" w:hAnsi="Consolas"/>
+          <w:color w:val="24292E"/>
+          <w:sz w:val="17"/>
+        </w:rPr>
+        <w:t>│  load_to_ods.py</w:t>
+      </w:r>
+      <w:proofErr w:type="gramEnd"/>
+      <w:r>
+        <w:rPr>
+          <w:rFonts w:ascii="Consolas" w:eastAsia="Consolas" w:hAnsi="Consolas"/>
+          <w:color w:val="24292E"/>
+          <w:sz w:val="17"/>
+        </w:rPr>
+        <w:t xml:space="preserve">  (</w:t>
+      </w:r>
+      <w:proofErr w:type="spellStart"/>
+      <w:r>
+        <w:rPr>
+          <w:rFonts w:ascii="Consolas" w:eastAsia="Consolas" w:hAnsi="Consolas"/>
+          <w:color w:val="24292E"/>
+          <w:sz w:val="17"/>
+        </w:rPr>
+        <w:t>DuckDB</w:t>
+      </w:r>
+      <w:proofErr w:type="spellEnd"/>
+      <w:r>
+        <w:rPr>
+          <w:rFonts w:ascii="Consolas" w:eastAsia="Consolas" w:hAnsi="Consolas"/>
+          <w:color w:val="24292E"/>
+          <w:sz w:val="17"/>
+        </w:rPr>
+        <w:t xml:space="preserve"> </w:t>
+      </w:r>
+      <w:proofErr w:type="spellStart"/>
+      <w:r>
+        <w:rPr>
+          <w:rFonts w:ascii="Consolas" w:eastAsia="Consolas" w:hAnsi="Consolas"/>
+          <w:color w:val="24292E"/>
+          <w:sz w:val="17"/>
+        </w:rPr>
+        <w:t>read_xlsx</w:t>
+      </w:r>
+      <w:proofErr w:type="spellEnd"/>
+      <w:r>
+        <w:rPr>
+          <w:rFonts w:ascii="Consolas" w:eastAsia="Consolas" w:hAnsi="Consolas"/>
+          <w:color w:val="24292E"/>
+          <w:sz w:val="17"/>
+        </w:rPr>
+        <w:t>)</w:t>
       </w:r>
     </w:p>
     <w:p>
@@ -2889,13 +3064,43 @@
         <w:spacing w:after="0" w:line="240" w:lineRule="auto"/>
         <w:ind w:left="113"/>
       </w:pPr>
+      <w:proofErr w:type="spellStart"/>
+      <w:proofErr w:type="gramStart"/>
       <w:r>
         <w:rPr>
           <w:rFonts w:ascii="Consolas" w:eastAsia="Consolas" w:hAnsi="Consolas"/>
           <w:color w:val="24292E"/>
           <w:sz w:val="17"/>
         </w:rPr>
-        <w:t>ods.superstore ─────────────── source('ods', 'superstore')</w:t>
+        <w:t>ods.superstore</w:t>
+      </w:r>
+      <w:proofErr w:type="spellEnd"/>
+      <w:proofErr w:type="gramEnd"/>
+      <w:r>
+        <w:rPr>
+          <w:rFonts w:ascii="Consolas" w:eastAsia="Consolas" w:hAnsi="Consolas"/>
+          <w:color w:val="24292E"/>
+          <w:sz w:val="17"/>
+        </w:rPr>
+        <w:t xml:space="preserve"> ─────────────── source('</w:t>
+      </w:r>
+      <w:proofErr w:type="spellStart"/>
+      <w:r>
+        <w:rPr>
+          <w:rFonts w:ascii="Consolas" w:eastAsia="Consolas" w:hAnsi="Consolas"/>
+          <w:color w:val="24292E"/>
+          <w:sz w:val="17"/>
+        </w:rPr>
+        <w:t>ods</w:t>
+      </w:r>
+      <w:proofErr w:type="spellEnd"/>
+      <w:r>
+        <w:rPr>
+          <w:rFonts w:ascii="Consolas" w:eastAsia="Consolas" w:hAnsi="Consolas"/>
+          <w:color w:val="24292E"/>
+          <w:sz w:val="17"/>
+        </w:rPr>
+        <w:t>', 'superstore')</w:t>
       </w:r>
     </w:p>
     <w:p>
@@ -2949,13 +3154,41 @@
         <w:spacing w:after="0" w:line="240" w:lineRule="auto"/>
         <w:ind w:left="113"/>
       </w:pPr>
+      <w:proofErr w:type="spellStart"/>
       <w:r>
         <w:rPr>
           <w:rFonts w:ascii="Consolas" w:eastAsia="Consolas" w:hAnsi="Consolas"/>
           <w:color w:val="24292E"/>
           <w:sz w:val="17"/>
         </w:rPr>
-        <w:t>main_stg.stg_superstore  (view)</w:t>
+        <w:t>main_stg.stg_</w:t>
+      </w:r>
+      <w:proofErr w:type="gramStart"/>
+      <w:r>
+        <w:rPr>
+          <w:rFonts w:ascii="Consolas" w:eastAsia="Consolas" w:hAnsi="Consolas"/>
+          <w:color w:val="24292E"/>
+          <w:sz w:val="17"/>
+        </w:rPr>
+        <w:t>superstore</w:t>
+      </w:r>
+      <w:proofErr w:type="spellEnd"/>
+      <w:r>
+        <w:rPr>
+          <w:rFonts w:ascii="Consolas" w:eastAsia="Consolas" w:hAnsi="Consolas"/>
+          <w:color w:val="24292E"/>
+          <w:sz w:val="17"/>
+        </w:rPr>
+        <w:t xml:space="preserve">  (</w:t>
+      </w:r>
+      <w:proofErr w:type="gramEnd"/>
+      <w:r>
+        <w:rPr>
+          <w:rFonts w:ascii="Consolas" w:eastAsia="Consolas" w:hAnsi="Consolas"/>
+          <w:color w:val="24292E"/>
+          <w:sz w:val="17"/>
+        </w:rPr>
+        <w:t>view)</w:t>
       </w:r>
     </w:p>
     <w:p>
@@ -2995,7 +3228,43 @@
           <w:color w:val="24292E"/>
           <w:sz w:val="17"/>
         </w:rPr>
-        <w:t xml:space="preserve">      ├──► main_dwh.dim_customer  ──┐</w:t>
+        <w:t xml:space="preserve">      ├──► </w:t>
+      </w:r>
+      <w:proofErr w:type="spellStart"/>
+      <w:r>
+        <w:rPr>
+          <w:rFonts w:ascii="Consolas" w:eastAsia="Consolas" w:hAnsi="Consolas"/>
+          <w:color w:val="24292E"/>
+          <w:sz w:val="17"/>
+        </w:rPr>
+        <w:t>main_dwh.dim_</w:t>
+      </w:r>
+      <w:proofErr w:type="gramStart"/>
+      <w:r>
+        <w:rPr>
+          <w:rFonts w:ascii="Consolas" w:eastAsia="Consolas" w:hAnsi="Consolas"/>
+          <w:color w:val="24292E"/>
+          <w:sz w:val="17"/>
+        </w:rPr>
+        <w:t>customer</w:t>
+      </w:r>
+      <w:proofErr w:type="spellEnd"/>
+      <w:r>
+        <w:rPr>
+          <w:rFonts w:ascii="Consolas" w:eastAsia="Consolas" w:hAnsi="Consolas"/>
+          <w:color w:val="24292E"/>
+          <w:sz w:val="17"/>
+        </w:rPr>
+        <w:t xml:space="preserve">  ─</w:t>
+      </w:r>
+      <w:proofErr w:type="gramEnd"/>
+      <w:r>
+        <w:rPr>
+          <w:rFonts w:ascii="Consolas" w:eastAsia="Consolas" w:hAnsi="Consolas"/>
+          <w:color w:val="24292E"/>
+          <w:sz w:val="17"/>
+        </w:rPr>
+        <w:t>─┐</w:t>
       </w:r>
     </w:p>
     <w:p>
@@ -3015,7 +3284,25 @@
           <w:color w:val="24292E"/>
           <w:sz w:val="17"/>
         </w:rPr>
-        <w:t xml:space="preserve">      ├──► main_dwh.dim_product   ──┤</w:t>
+        <w:t xml:space="preserve">      ├──► </w:t>
+      </w:r>
+      <w:proofErr w:type="spellStart"/>
+      <w:r>
+        <w:rPr>
+          <w:rFonts w:ascii="Consolas" w:eastAsia="Consolas" w:hAnsi="Consolas"/>
+          <w:color w:val="24292E"/>
+          <w:sz w:val="17"/>
+        </w:rPr>
+        <w:t>main_dwh.dim_product</w:t>
+      </w:r>
+      <w:proofErr w:type="spellEnd"/>
+      <w:r>
+        <w:rPr>
+          <w:rFonts w:ascii="Consolas" w:eastAsia="Consolas" w:hAnsi="Consolas"/>
+          <w:color w:val="24292E"/>
+          <w:sz w:val="17"/>
+        </w:rPr>
+        <w:t xml:space="preserve">   ──┤</w:t>
       </w:r>
     </w:p>
     <w:p>
@@ -3035,8 +3322,54 @@
           <w:color w:val="24292E"/>
           <w:sz w:val="17"/>
         </w:rPr>
-        <w:t xml:space="preserve">      ├──► main_dwh.dim_location  ──┼──► main_dwh.fact_orders</w:t>
-      </w:r>
+        <w:t xml:space="preserve">      ├──► </w:t>
+      </w:r>
+      <w:proofErr w:type="spellStart"/>
+      <w:r>
+        <w:rPr>
+          <w:rFonts w:ascii="Consolas" w:eastAsia="Consolas" w:hAnsi="Consolas"/>
+          <w:color w:val="24292E"/>
+          <w:sz w:val="17"/>
+        </w:rPr>
+        <w:t>main_dwh.dim_</w:t>
+      </w:r>
+      <w:proofErr w:type="gramStart"/>
+      <w:r>
+        <w:rPr>
+          <w:rFonts w:ascii="Consolas" w:eastAsia="Consolas" w:hAnsi="Consolas"/>
+          <w:color w:val="24292E"/>
+          <w:sz w:val="17"/>
+        </w:rPr>
+        <w:t>location</w:t>
+      </w:r>
+      <w:proofErr w:type="spellEnd"/>
+      <w:r>
+        <w:rPr>
+          <w:rFonts w:ascii="Consolas" w:eastAsia="Consolas" w:hAnsi="Consolas"/>
+          <w:color w:val="24292E"/>
+          <w:sz w:val="17"/>
+        </w:rPr>
+        <w:t xml:space="preserve">  ─</w:t>
+      </w:r>
+      <w:proofErr w:type="gramEnd"/>
+      <w:r>
+        <w:rPr>
+          <w:rFonts w:ascii="Consolas" w:eastAsia="Consolas" w:hAnsi="Consolas"/>
+          <w:color w:val="24292E"/>
+          <w:sz w:val="17"/>
+        </w:rPr>
+        <w:t xml:space="preserve">─┼──► </w:t>
+      </w:r>
+      <w:proofErr w:type="spellStart"/>
+      <w:r>
+        <w:rPr>
+          <w:rFonts w:ascii="Consolas" w:eastAsia="Consolas" w:hAnsi="Consolas"/>
+          <w:color w:val="24292E"/>
+          <w:sz w:val="17"/>
+        </w:rPr>
+        <w:t>main_dwh.fact_orders</w:t>
+      </w:r>
+      <w:proofErr w:type="spellEnd"/>
     </w:p>
     <w:p>
       <w:pPr>
@@ -3055,12 +3388,56 @@
           <w:color w:val="24292E"/>
           <w:sz w:val="17"/>
         </w:rPr>
-        <w:t xml:space="preserve">      └──► main_dwh.dim_date      ──┘     (joined twice: order &amp; ship date)</w:t>
+        <w:t xml:space="preserve">      └──► </w:t>
+      </w:r>
+      <w:proofErr w:type="spellStart"/>
+      <w:r>
+        <w:rPr>
+          <w:rFonts w:ascii="Consolas" w:eastAsia="Consolas" w:hAnsi="Consolas"/>
+          <w:color w:val="24292E"/>
+          <w:sz w:val="17"/>
+        </w:rPr>
+        <w:t>main_dwh.dim_date</w:t>
+      </w:r>
+      <w:proofErr w:type="spellEnd"/>
+      <w:r>
+        <w:rPr>
+          <w:rFonts w:ascii="Consolas" w:eastAsia="Consolas" w:hAnsi="Consolas"/>
+          <w:color w:val="24292E"/>
+          <w:sz w:val="17"/>
+        </w:rPr>
+        <w:t xml:space="preserve">      ──┘  </w:t>
+      </w:r>
+      <w:proofErr w:type="gramStart"/>
+      <w:r>
+        <w:rPr>
+          <w:rFonts w:ascii="Consolas" w:eastAsia="Consolas" w:hAnsi="Consolas"/>
+          <w:color w:val="24292E"/>
+          <w:sz w:val="17"/>
+        </w:rPr>
+        <w:t xml:space="preserve">   (</w:t>
+      </w:r>
+      <w:proofErr w:type="gramEnd"/>
+      <w:r>
+        <w:rPr>
+          <w:rFonts w:ascii="Consolas" w:eastAsia="Consolas" w:hAnsi="Consolas"/>
+          <w:color w:val="24292E"/>
+          <w:sz w:val="17"/>
+        </w:rPr>
+        <w:t>joined twice: order &amp; ship date)</w:t>
       </w:r>
     </w:p>
     <w:p>
       <w:r>
-        <w:t>The same lineage, as rendered by dbt docs:</w:t>
+        <w:t xml:space="preserve">The same lineage, as rendered by </w:t>
+      </w:r>
+      <w:proofErr w:type="spellStart"/>
+      <w:r>
+        <w:t>dbt</w:t>
+      </w:r>
+      <w:proofErr w:type="spellEnd"/>
+      <w:r>
+        <w:t xml:space="preserve"> docs:</w:t>
       </w:r>
     </w:p>
     <w:p>
@@ -3090,7 +3467,7 @@
                     <pic:cNvPicPr/>
                   </pic:nvPicPr>
                   <pic:blipFill>
-                    <a:blip r:embed="rId10"/>
+                    <a:blip r:embed="rId9"/>
                     <a:stretch>
                       <a:fillRect/>
                     </a:stretch>
@@ -3122,8 +3499,28 @@
           <w:i/>
           <w:color w:val="595959"/>
         </w:rPr>
-        <w:t xml:space="preserve">Figure 1: dbt lineage graph. The </w:t>
-      </w:r>
+        <w:t xml:space="preserve">Figure 1: </w:t>
+      </w:r>
+      <w:proofErr w:type="spellStart"/>
+      <w:r>
+        <w:rPr>
+          <w:b w:val="0"/>
+          <w:i/>
+          <w:color w:val="595959"/>
+        </w:rPr>
+        <w:t>dbt</w:t>
+      </w:r>
+      <w:proofErr w:type="spellEnd"/>
+      <w:r>
+        <w:rPr>
+          <w:b w:val="0"/>
+          <w:i/>
+          <w:color w:val="595959"/>
+        </w:rPr>
+        <w:t xml:space="preserve"> lineage graph. The </w:t>
+      </w:r>
+      <w:proofErr w:type="spellStart"/>
+      <w:proofErr w:type="gramStart"/>
       <w:r>
         <w:rPr>
           <w:rFonts w:ascii="Consolas" w:hAnsi="Consolas"/>
@@ -3134,6 +3531,8 @@
         </w:rPr>
         <w:t>ods.superstore</w:t>
       </w:r>
+      <w:proofErr w:type="spellEnd"/>
+      <w:proofErr w:type="gramEnd"/>
       <w:r>
         <w:rPr>
           <w:b w:val="0"/>
@@ -3147,43 +3546,65 @@
       <w:r>
         <w:t xml:space="preserve">To explore it yourself, run </w:t>
       </w:r>
+      <w:proofErr w:type="spellStart"/>
       <w:r>
         <w:rPr>
           <w:rFonts w:ascii="Consolas" w:hAnsi="Consolas"/>
           <w:color w:val="C7254E"/>
           <w:sz w:val="19"/>
         </w:rPr>
-        <w:t>dbt docs generate</w:t>
-      </w:r>
-      <w:r>
-        <w:t xml:space="preserve"> and then </w:t>
-      </w:r>
+        <w:t>dbt</w:t>
+      </w:r>
+      <w:proofErr w:type="spellEnd"/>
       <w:r>
         <w:rPr>
           <w:rFonts w:ascii="Consolas" w:hAnsi="Consolas"/>
           <w:color w:val="C7254E"/>
           <w:sz w:val="19"/>
         </w:rPr>
-        <w:t>dbt docs serve --port</w:t>
-      </w:r>
+        <w:t xml:space="preserve"> docs generate</w:t>
+      </w:r>
+      <w:r>
+        <w:t xml:space="preserve"> and then </w:t>
+      </w:r>
+      <w:proofErr w:type="spellStart"/>
       <w:r>
         <w:rPr>
           <w:rFonts w:ascii="Consolas" w:hAnsi="Consolas"/>
           <w:color w:val="C7254E"/>
           <w:sz w:val="19"/>
         </w:rPr>
-        <w:t xml:space="preserve"> 8081</w:t>
-      </w:r>
-      <w:r>
-        <w:t xml:space="preserve"> from </w:t>
-      </w:r>
+        <w:t>dbt</w:t>
+      </w:r>
+      <w:proofErr w:type="spellEnd"/>
       <w:r>
         <w:rPr>
           <w:rFonts w:ascii="Consolas" w:hAnsi="Consolas"/>
           <w:color w:val="C7254E"/>
           <w:sz w:val="19"/>
         </w:rPr>
-        <w:t>my_project/</w:t>
+        <w:t xml:space="preserve"> docs serve --port 8081</w:t>
+      </w:r>
+      <w:r>
+        <w:t xml:space="preserve"> from </w:t>
+      </w:r>
+      <w:proofErr w:type="spellStart"/>
+      <w:r>
+        <w:rPr>
+          <w:rFonts w:ascii="Consolas" w:hAnsi="Consolas"/>
+          <w:color w:val="C7254E"/>
+          <w:sz w:val="19"/>
+        </w:rPr>
+        <w:t>my_project</w:t>
+      </w:r>
+      <w:proofErr w:type="spellEnd"/>
+      <w:r>
+        <w:rPr>
+          <w:rFonts w:ascii="Consolas" w:hAnsi="Consolas"/>
+          <w:color w:val="C7254E"/>
+          <w:sz w:val="19"/>
+        </w:rPr>
+        <w:t>/</w:t>
       </w:r>
       <w:r>
         <w:t>. Port 8081 avoids a clash with Airflow on 8080.</w:t>
@@ -3208,9 +3629,16 @@
       </w:pPr>
       <w:bookmarkStart w:id="5" w:name="_Toc241795012"/>
       <w:r>
-        <w:t>4.1 ODS — ods.superstore</w:t>
+        <w:t xml:space="preserve">4.1 ODS — </w:t>
+      </w:r>
+      <w:proofErr w:type="spellStart"/>
+      <w:proofErr w:type="gramStart"/>
+      <w:r>
+        <w:t>ods.superstore</w:t>
       </w:r>
       <w:bookmarkEnd w:id="5"/>
+      <w:proofErr w:type="spellEnd"/>
+      <w:proofErr w:type="gramEnd"/>
     </w:p>
     <w:p>
       <w:pPr>
@@ -3225,22 +3653,14 @@
       <w:r>
         <w:t xml:space="preserve"> </w:t>
       </w:r>
-      <w:hyperlink r:id="rId11">
+      <w:hyperlink r:id="rId10">
         <w:r>
           <w:rPr>
             <w:rFonts w:ascii="Consolas" w:hAnsi="Consolas" w:cs="Consolas"/>
             <w:color w:val="2E75B6"/>
             <w:u w:val="single"/>
           </w:rPr>
-          <w:t>script</w:t>
-        </w:r>
-        <w:r>
-          <w:rPr>
-            <w:rFonts w:ascii="Consolas" w:hAnsi="Consolas" w:cs="Consolas"/>
-            <w:color w:val="2E75B6"/>
-            <w:u w:val="single"/>
-          </w:rPr>
-          <w:t>s/load_to_ods.py</w:t>
+          <w:t>scripts/load_to_ods.py</w:t>
         </w:r>
       </w:hyperlink>
     </w:p>
@@ -3263,10 +3683,36 @@
           <w:color w:val="C7254E"/>
           <w:sz w:val="19"/>
         </w:rPr>
-        <w:t>CREATE OR REPLACE TABLE … AS SELECT * FROM read_xlsx(...)</w:t>
-      </w:r>
-      <w:r>
-        <w:t xml:space="preserve"> using DuckDB's </w:t>
+        <w:t xml:space="preserve">CREATE OR REPLACE TABLE … AS SELECT * FROM </w:t>
+      </w:r>
+      <w:proofErr w:type="spellStart"/>
+      <w:r>
+        <w:rPr>
+          <w:rFonts w:ascii="Consolas" w:hAnsi="Consolas"/>
+          <w:color w:val="C7254E"/>
+          <w:sz w:val="19"/>
+        </w:rPr>
+        <w:t>read_xlsx</w:t>
+      </w:r>
+      <w:proofErr w:type="spellEnd"/>
+      <w:r>
+        <w:rPr>
+          <w:rFonts w:ascii="Consolas" w:hAnsi="Consolas"/>
+          <w:color w:val="C7254E"/>
+          <w:sz w:val="19"/>
+        </w:rPr>
+        <w:t>(...)</w:t>
+      </w:r>
+      <w:r>
+        <w:t xml:space="preserve"> using </w:t>
+      </w:r>
+      <w:proofErr w:type="spellStart"/>
+      <w:r>
+        <w:t>DuckDB's</w:t>
+      </w:r>
+      <w:proofErr w:type="spellEnd"/>
+      <w:r>
+        <w:t xml:space="preserve"> </w:t>
       </w:r>
       <w:r>
         <w:rPr>
@@ -3305,10 +3751,7 @@
         <w:t>Columns:</w:t>
       </w:r>
       <w:r>
-        <w:t xml:space="preserve"> kept exactly as in the spreadsheet, including spaces in na</w:t>
-      </w:r>
-      <w:r>
-        <w:t xml:space="preserve">mes (e.g. </w:t>
+        <w:t xml:space="preserve"> kept exactly as in the spreadsheet, including spaces in names (e.g. </w:t>
       </w:r>
       <w:r>
         <w:rPr>
@@ -3328,9 +3771,14 @@
       </w:pPr>
       <w:bookmarkStart w:id="6" w:name="_Toc241795013"/>
       <w:r>
-        <w:t>4.2 Staging — main_stg.stg_superstore</w:t>
+        <w:t xml:space="preserve">4.2 Staging — </w:t>
+      </w:r>
+      <w:proofErr w:type="spellStart"/>
+      <w:r>
+        <w:t>main_stg.stg_superstore</w:t>
       </w:r>
       <w:bookmarkEnd w:id="6"/>
+      <w:proofErr w:type="spellEnd"/>
     </w:p>
     <w:p>
       <w:pPr>
@@ -3365,6 +3813,7 @@
       <w:r>
         <w:t xml:space="preserve">Renames every column to </w:t>
       </w:r>
+      <w:proofErr w:type="spellStart"/>
       <w:r>
         <w:rPr>
           <w:rFonts w:ascii="Consolas" w:hAnsi="Consolas"/>
@@ -3373,6 +3822,7 @@
         </w:rPr>
         <w:t>snake_case</w:t>
       </w:r>
+      <w:proofErr w:type="spellEnd"/>
     </w:p>
     <w:p>
       <w:pPr>
@@ -3442,9 +3892,14 @@
       </w:pPr>
       <w:bookmarkStart w:id="7" w:name="_Toc241795014"/>
       <w:r>
-        <w:t>4.3 Marts — main_dwh.*</w:t>
+        <w:t>4.3 Marts — main_</w:t>
+      </w:r>
+      <w:proofErr w:type="gramStart"/>
+      <w:r>
+        <w:t>dwh.*</w:t>
       </w:r>
       <w:bookmarkEnd w:id="7"/>
+      <w:proofErr w:type="gramEnd"/>
     </w:p>
     <w:p>
       <w:pPr>
@@ -3459,13 +3914,23 @@
       <w:r>
         <w:t xml:space="preserve"> table (rebuilt on every </w:t>
       </w:r>
+      <w:proofErr w:type="spellStart"/>
       <w:r>
         <w:rPr>
           <w:rFonts w:ascii="Consolas" w:hAnsi="Consolas"/>
           <w:color w:val="C7254E"/>
           <w:sz w:val="19"/>
         </w:rPr>
-        <w:t>dbt run</w:t>
+        <w:t>dbt</w:t>
+      </w:r>
+      <w:proofErr w:type="spellEnd"/>
+      <w:r>
+        <w:rPr>
+          <w:rFonts w:ascii="Consolas" w:hAnsi="Consolas"/>
+          <w:color w:val="C7254E"/>
+          <w:sz w:val="19"/>
+        </w:rPr>
+        <w:t xml:space="preserve"> run</w:t>
       </w:r>
       <w:r>
         <w:t>)</w:t>
@@ -3515,10 +3980,12 @@
         <w:pStyle w:val="Heading2"/>
       </w:pPr>
       <w:bookmarkStart w:id="9" w:name="_Toc241795016"/>
+      <w:proofErr w:type="spellStart"/>
       <w:r>
         <w:t>fact_orders</w:t>
       </w:r>
       <w:bookmarkEnd w:id="9"/>
+      <w:proofErr w:type="spellEnd"/>
     </w:p>
     <w:p>
       <w:r>
@@ -3635,6 +4102,7 @@
               <w:keepNext/>
               <w:spacing w:before="40" w:after="40"/>
             </w:pPr>
+            <w:proofErr w:type="spellStart"/>
             <w:r>
               <w:rPr>
                 <w:rFonts w:ascii="Consolas" w:hAnsi="Consolas"/>
@@ -3643,6 +4111,7 @@
               </w:rPr>
               <w:t>sales_key</w:t>
             </w:r>
+            <w:proofErr w:type="spellEnd"/>
           </w:p>
         </w:tc>
         <w:tc>
@@ -3709,6 +4178,7 @@
               <w:keepNext/>
               <w:spacing w:before="40" w:after="40"/>
             </w:pPr>
+            <w:proofErr w:type="spellStart"/>
             <w:r>
               <w:rPr>
                 <w:rFonts w:ascii="Consolas" w:hAnsi="Consolas"/>
@@ -3717,6 +4187,7 @@
               </w:rPr>
               <w:t>order_id</w:t>
             </w:r>
+            <w:proofErr w:type="spellEnd"/>
           </w:p>
         </w:tc>
         <w:tc>
@@ -3770,6 +4241,7 @@
               <w:keepNext/>
               <w:spacing w:before="40" w:after="40"/>
             </w:pPr>
+            <w:proofErr w:type="spellStart"/>
             <w:r>
               <w:rPr>
                 <w:rFonts w:ascii="Consolas" w:hAnsi="Consolas"/>
@@ -3778,6 +4250,7 @@
               </w:rPr>
               <w:t>order_date_key</w:t>
             </w:r>
+            <w:proofErr w:type="spellEnd"/>
           </w:p>
         </w:tc>
         <w:tc>
@@ -3812,14 +4285,34 @@
               </w:rPr>
               <w:t xml:space="preserve">FK → </w:t>
             </w:r>
+            <w:proofErr w:type="spellStart"/>
             <w:r>
               <w:rPr>
                 <w:rFonts w:ascii="Consolas" w:hAnsi="Consolas"/>
                 <w:color w:val="C7254E"/>
                 <w:sz w:val="16"/>
               </w:rPr>
-              <w:t>dim_date.date_key</w:t>
-            </w:r>
+              <w:t>dim_</w:t>
+            </w:r>
+            <w:proofErr w:type="gramStart"/>
+            <w:r>
+              <w:rPr>
+                <w:rFonts w:ascii="Consolas" w:hAnsi="Consolas"/>
+                <w:color w:val="C7254E"/>
+                <w:sz w:val="16"/>
+              </w:rPr>
+              <w:t>date.date</w:t>
+            </w:r>
+            <w:proofErr w:type="gramEnd"/>
+            <w:r>
+              <w:rPr>
+                <w:rFonts w:ascii="Consolas" w:hAnsi="Consolas"/>
+                <w:color w:val="C7254E"/>
+                <w:sz w:val="16"/>
+              </w:rPr>
+              <w:t>_key</w:t>
+            </w:r>
+            <w:proofErr w:type="spellEnd"/>
             <w:r>
               <w:rPr>
                 <w:sz w:val="18"/>
@@ -3844,6 +4337,7 @@
               <w:keepNext/>
               <w:spacing w:before="40" w:after="40"/>
             </w:pPr>
+            <w:proofErr w:type="spellStart"/>
             <w:r>
               <w:rPr>
                 <w:rFonts w:ascii="Consolas" w:hAnsi="Consolas"/>
@@ -3852,6 +4346,7 @@
               </w:rPr>
               <w:t>ship_date_key</w:t>
             </w:r>
+            <w:proofErr w:type="spellEnd"/>
           </w:p>
         </w:tc>
         <w:tc>
@@ -3888,14 +4383,34 @@
               </w:rPr>
               <w:t xml:space="preserve">FK → </w:t>
             </w:r>
+            <w:proofErr w:type="spellStart"/>
             <w:r>
               <w:rPr>
                 <w:rFonts w:ascii="Consolas" w:hAnsi="Consolas"/>
                 <w:color w:val="C7254E"/>
                 <w:sz w:val="16"/>
               </w:rPr>
-              <w:t>dim_date.date_key</w:t>
-            </w:r>
+              <w:t>dim_</w:t>
+            </w:r>
+            <w:proofErr w:type="gramStart"/>
+            <w:r>
+              <w:rPr>
+                <w:rFonts w:ascii="Consolas" w:hAnsi="Consolas"/>
+                <w:color w:val="C7254E"/>
+                <w:sz w:val="16"/>
+              </w:rPr>
+              <w:t>date.date</w:t>
+            </w:r>
+            <w:proofErr w:type="gramEnd"/>
+            <w:r>
+              <w:rPr>
+                <w:rFonts w:ascii="Consolas" w:hAnsi="Consolas"/>
+                <w:color w:val="C7254E"/>
+                <w:sz w:val="16"/>
+              </w:rPr>
+              <w:t>_key</w:t>
+            </w:r>
+            <w:proofErr w:type="spellEnd"/>
             <w:r>
               <w:rPr>
                 <w:sz w:val="18"/>
@@ -3919,6 +4434,7 @@
               <w:keepNext/>
               <w:spacing w:before="40" w:after="40"/>
             </w:pPr>
+            <w:proofErr w:type="spellStart"/>
             <w:r>
               <w:rPr>
                 <w:rFonts w:ascii="Consolas" w:hAnsi="Consolas"/>
@@ -3927,6 +4443,7 @@
               </w:rPr>
               <w:t>customer_key</w:t>
             </w:r>
+            <w:proofErr w:type="spellEnd"/>
           </w:p>
         </w:tc>
         <w:tc>
@@ -3961,14 +4478,34 @@
               </w:rPr>
               <w:t xml:space="preserve">FK → </w:t>
             </w:r>
+            <w:proofErr w:type="spellStart"/>
             <w:r>
               <w:rPr>
                 <w:rFonts w:ascii="Consolas" w:hAnsi="Consolas"/>
                 <w:color w:val="C7254E"/>
                 <w:sz w:val="16"/>
               </w:rPr>
-              <w:t>dim_customer.customer_key</w:t>
-            </w:r>
+              <w:t>dim_</w:t>
+            </w:r>
+            <w:proofErr w:type="gramStart"/>
+            <w:r>
+              <w:rPr>
+                <w:rFonts w:ascii="Consolas" w:hAnsi="Consolas"/>
+                <w:color w:val="C7254E"/>
+                <w:sz w:val="16"/>
+              </w:rPr>
+              <w:t>customer.customer</w:t>
+            </w:r>
+            <w:proofErr w:type="gramEnd"/>
+            <w:r>
+              <w:rPr>
+                <w:rFonts w:ascii="Consolas" w:hAnsi="Consolas"/>
+                <w:color w:val="C7254E"/>
+                <w:sz w:val="16"/>
+              </w:rPr>
+              <w:t>_key</w:t>
+            </w:r>
+            <w:proofErr w:type="spellEnd"/>
           </w:p>
         </w:tc>
       </w:tr>
@@ -3987,6 +4524,7 @@
               <w:keepNext/>
               <w:spacing w:before="40" w:after="40"/>
             </w:pPr>
+            <w:proofErr w:type="spellStart"/>
             <w:r>
               <w:rPr>
                 <w:rFonts w:ascii="Consolas" w:hAnsi="Consolas"/>
@@ -3995,6 +4533,7 @@
               </w:rPr>
               <w:t>product_key</w:t>
             </w:r>
+            <w:proofErr w:type="spellEnd"/>
           </w:p>
         </w:tc>
         <w:tc>
@@ -4031,14 +4570,34 @@
               </w:rPr>
               <w:t xml:space="preserve">FK → </w:t>
             </w:r>
+            <w:proofErr w:type="spellStart"/>
             <w:r>
               <w:rPr>
                 <w:rFonts w:ascii="Consolas" w:hAnsi="Consolas"/>
                 <w:color w:val="C7254E"/>
                 <w:sz w:val="16"/>
               </w:rPr>
-              <w:t>dim_product.product_key</w:t>
-            </w:r>
+              <w:t>dim_</w:t>
+            </w:r>
+            <w:proofErr w:type="gramStart"/>
+            <w:r>
+              <w:rPr>
+                <w:rFonts w:ascii="Consolas" w:hAnsi="Consolas"/>
+                <w:color w:val="C7254E"/>
+                <w:sz w:val="16"/>
+              </w:rPr>
+              <w:t>product.product</w:t>
+            </w:r>
+            <w:proofErr w:type="gramEnd"/>
+            <w:r>
+              <w:rPr>
+                <w:rFonts w:ascii="Consolas" w:hAnsi="Consolas"/>
+                <w:color w:val="C7254E"/>
+                <w:sz w:val="16"/>
+              </w:rPr>
+              <w:t>_key</w:t>
+            </w:r>
+            <w:proofErr w:type="spellEnd"/>
           </w:p>
         </w:tc>
       </w:tr>
@@ -4056,6 +4615,7 @@
               <w:keepNext/>
               <w:spacing w:before="40" w:after="40"/>
             </w:pPr>
+            <w:proofErr w:type="spellStart"/>
             <w:r>
               <w:rPr>
                 <w:rFonts w:ascii="Consolas" w:hAnsi="Consolas"/>
@@ -4064,6 +4624,7 @@
               </w:rPr>
               <w:t>geography_key</w:t>
             </w:r>
+            <w:proofErr w:type="spellEnd"/>
           </w:p>
         </w:tc>
         <w:tc>
@@ -4098,14 +4659,34 @@
               </w:rPr>
               <w:t xml:space="preserve">FK → </w:t>
             </w:r>
+            <w:proofErr w:type="spellStart"/>
             <w:r>
               <w:rPr>
                 <w:rFonts w:ascii="Consolas" w:hAnsi="Consolas"/>
                 <w:color w:val="C7254E"/>
                 <w:sz w:val="16"/>
               </w:rPr>
-              <w:t>dim_location.geography_key</w:t>
-            </w:r>
+              <w:t>dim_</w:t>
+            </w:r>
+            <w:proofErr w:type="gramStart"/>
+            <w:r>
+              <w:rPr>
+                <w:rFonts w:ascii="Consolas" w:hAnsi="Consolas"/>
+                <w:color w:val="C7254E"/>
+                <w:sz w:val="16"/>
+              </w:rPr>
+              <w:t>location.geography</w:t>
+            </w:r>
+            <w:proofErr w:type="gramEnd"/>
+            <w:r>
+              <w:rPr>
+                <w:rFonts w:ascii="Consolas" w:hAnsi="Consolas"/>
+                <w:color w:val="C7254E"/>
+                <w:sz w:val="16"/>
+              </w:rPr>
+              <w:t>_key</w:t>
+            </w:r>
+            <w:proofErr w:type="spellEnd"/>
           </w:p>
         </w:tc>
       </w:tr>
@@ -4124,6 +4705,7 @@
               <w:keepNext/>
               <w:spacing w:before="40" w:after="40"/>
             </w:pPr>
+            <w:proofErr w:type="spellStart"/>
             <w:r>
               <w:rPr>
                 <w:rFonts w:ascii="Consolas" w:hAnsi="Consolas"/>
@@ -4132,6 +4714,7 @@
               </w:rPr>
               <w:t>ship_mode</w:t>
             </w:r>
+            <w:proofErr w:type="spellEnd"/>
           </w:p>
         </w:tc>
         <w:tc>
@@ -4421,10 +5004,12 @@
         <w:pStyle w:val="Heading2"/>
       </w:pPr>
       <w:bookmarkStart w:id="10" w:name="_Toc241795017"/>
+      <w:proofErr w:type="spellStart"/>
       <w:r>
         <w:t>dim_customer</w:t>
       </w:r>
       <w:bookmarkEnd w:id="10"/>
+      <w:proofErr w:type="spellEnd"/>
     </w:p>
     <w:p>
       <w:r>
@@ -4532,6 +5117,7 @@
               <w:keepNext/>
               <w:spacing w:before="40" w:after="40"/>
             </w:pPr>
+            <w:proofErr w:type="spellStart"/>
             <w:r>
               <w:rPr>
                 <w:rFonts w:ascii="Consolas" w:hAnsi="Consolas"/>
@@ -4540,6 +5126,7 @@
               </w:rPr>
               <w:t>customer_key</w:t>
             </w:r>
+            <w:proofErr w:type="spellEnd"/>
           </w:p>
         </w:tc>
         <w:tc>
@@ -4580,7 +5167,25 @@
                 <w:color w:val="C7254E"/>
                 <w:sz w:val="16"/>
               </w:rPr>
-              <w:t>md5(customer_id)</w:t>
+              <w:t>md5(</w:t>
+            </w:r>
+            <w:proofErr w:type="spellStart"/>
+            <w:r>
+              <w:rPr>
+                <w:rFonts w:ascii="Consolas" w:hAnsi="Consolas"/>
+                <w:color w:val="C7254E"/>
+                <w:sz w:val="16"/>
+              </w:rPr>
+              <w:t>customer_id</w:t>
+            </w:r>
+            <w:proofErr w:type="spellEnd"/>
+            <w:r>
+              <w:rPr>
+                <w:rFonts w:ascii="Consolas" w:hAnsi="Consolas"/>
+                <w:color w:val="C7254E"/>
+                <w:sz w:val="16"/>
+              </w:rPr>
+              <w:t>)</w:t>
             </w:r>
           </w:p>
         </w:tc>
@@ -4600,6 +5205,7 @@
               <w:keepNext/>
               <w:spacing w:before="40" w:after="40"/>
             </w:pPr>
+            <w:proofErr w:type="spellStart"/>
             <w:r>
               <w:rPr>
                 <w:rFonts w:ascii="Consolas" w:hAnsi="Consolas"/>
@@ -4608,6 +5214,7 @@
               </w:rPr>
               <w:t>customer_id</w:t>
             </w:r>
+            <w:proofErr w:type="spellEnd"/>
           </w:p>
         </w:tc>
         <w:tc>
@@ -4661,6 +5268,7 @@
               <w:keepNext/>
               <w:spacing w:before="40" w:after="40"/>
             </w:pPr>
+            <w:proofErr w:type="spellStart"/>
             <w:r>
               <w:rPr>
                 <w:rFonts w:ascii="Consolas" w:hAnsi="Consolas"/>
@@ -4669,6 +5277,7 @@
               </w:rPr>
               <w:t>customer_name</w:t>
             </w:r>
+            <w:proofErr w:type="spellEnd"/>
           </w:p>
         </w:tc>
         <w:tc>
@@ -4760,13 +5369,7 @@
               <w:rPr>
                 <w:sz w:val="18"/>
               </w:rPr>
-              <w:t xml:space="preserve">Consumer / </w:t>
-            </w:r>
-            <w:r>
-              <w:rPr>
-                <w:sz w:val="18"/>
-              </w:rPr>
-              <w:t>Corporate / Home Office</w:t>
+              <w:t>Consumer / Corporate / Home Office</w:t>
             </w:r>
           </w:p>
         </w:tc>
@@ -4782,10 +5385,12 @@
         <w:pStyle w:val="Heading2"/>
       </w:pPr>
       <w:bookmarkStart w:id="11" w:name="_Toc241795018"/>
+      <w:proofErr w:type="spellStart"/>
       <w:r>
         <w:t>dim_product</w:t>
       </w:r>
       <w:bookmarkEnd w:id="11"/>
+      <w:proofErr w:type="spellEnd"/>
     </w:p>
     <w:p>
       <w:r>
@@ -4797,7 +5402,43 @@
           <w:color w:val="C7254E"/>
           <w:sz w:val="19"/>
         </w:rPr>
-        <w:t>(product_id, product_name)</w:t>
+        <w:t>(</w:t>
+      </w:r>
+      <w:proofErr w:type="spellStart"/>
+      <w:r>
+        <w:rPr>
+          <w:rFonts w:ascii="Consolas" w:hAnsi="Consolas"/>
+          <w:color w:val="C7254E"/>
+          <w:sz w:val="19"/>
+        </w:rPr>
+        <w:t>product_id</w:t>
+      </w:r>
+      <w:proofErr w:type="spellEnd"/>
+      <w:r>
+        <w:rPr>
+          <w:rFonts w:ascii="Consolas" w:hAnsi="Consolas"/>
+          <w:color w:val="C7254E"/>
+          <w:sz w:val="19"/>
+        </w:rPr>
+        <w:t xml:space="preserve">, </w:t>
+      </w:r>
+      <w:proofErr w:type="spellStart"/>
+      <w:r>
+        <w:rPr>
+          <w:rFonts w:ascii="Consolas" w:hAnsi="Consolas"/>
+          <w:color w:val="C7254E"/>
+          <w:sz w:val="19"/>
+        </w:rPr>
+        <w:t>product_name</w:t>
+      </w:r>
+      <w:proofErr w:type="spellEnd"/>
+      <w:r>
+        <w:rPr>
+          <w:rFonts w:ascii="Consolas" w:hAnsi="Consolas"/>
+          <w:color w:val="C7254E"/>
+          <w:sz w:val="19"/>
+        </w:rPr>
+        <w:t>)</w:t>
       </w:r>
       <w:r>
         <w:t xml:space="preserve"> pair.</w:t>
@@ -4904,6 +5545,7 @@
               <w:keepNext/>
               <w:spacing w:before="40" w:after="40"/>
             </w:pPr>
+            <w:proofErr w:type="spellStart"/>
             <w:r>
               <w:rPr>
                 <w:rFonts w:ascii="Consolas" w:hAnsi="Consolas"/>
@@ -4912,6 +5554,7 @@
               </w:rPr>
               <w:t>product_key</w:t>
             </w:r>
+            <w:proofErr w:type="spellEnd"/>
           </w:p>
         </w:tc>
         <w:tc>
@@ -4952,7 +5595,43 @@
                 <w:color w:val="C7254E"/>
                 <w:sz w:val="16"/>
               </w:rPr>
-              <w:t>md5(product_id | product_name)</w:t>
+              <w:t>md5(</w:t>
+            </w:r>
+            <w:proofErr w:type="spellStart"/>
+            <w:r>
+              <w:rPr>
+                <w:rFonts w:ascii="Consolas" w:hAnsi="Consolas"/>
+                <w:color w:val="C7254E"/>
+                <w:sz w:val="16"/>
+              </w:rPr>
+              <w:t>product_id</w:t>
+            </w:r>
+            <w:proofErr w:type="spellEnd"/>
+            <w:r>
+              <w:rPr>
+                <w:rFonts w:ascii="Consolas" w:hAnsi="Consolas"/>
+                <w:color w:val="C7254E"/>
+                <w:sz w:val="16"/>
+              </w:rPr>
+              <w:t xml:space="preserve"> | </w:t>
+            </w:r>
+            <w:proofErr w:type="spellStart"/>
+            <w:r>
+              <w:rPr>
+                <w:rFonts w:ascii="Consolas" w:hAnsi="Consolas"/>
+                <w:color w:val="C7254E"/>
+                <w:sz w:val="16"/>
+              </w:rPr>
+              <w:t>product_name</w:t>
+            </w:r>
+            <w:proofErr w:type="spellEnd"/>
+            <w:r>
+              <w:rPr>
+                <w:rFonts w:ascii="Consolas" w:hAnsi="Consolas"/>
+                <w:color w:val="C7254E"/>
+                <w:sz w:val="16"/>
+              </w:rPr>
+              <w:t>)</w:t>
             </w:r>
           </w:p>
         </w:tc>
@@ -4972,6 +5651,7 @@
               <w:keepNext/>
               <w:spacing w:before="40" w:after="40"/>
             </w:pPr>
+            <w:proofErr w:type="spellStart"/>
             <w:r>
               <w:rPr>
                 <w:rFonts w:ascii="Consolas" w:hAnsi="Consolas"/>
@@ -4980,6 +5660,7 @@
               </w:rPr>
               <w:t>product_id</w:t>
             </w:r>
+            <w:proofErr w:type="spellEnd"/>
           </w:p>
         </w:tc>
         <w:tc>
@@ -5033,6 +5714,7 @@
               <w:keepNext/>
               <w:spacing w:before="40" w:after="40"/>
             </w:pPr>
+            <w:proofErr w:type="spellStart"/>
             <w:r>
               <w:rPr>
                 <w:rFonts w:ascii="Consolas" w:hAnsi="Consolas"/>
@@ -5041,6 +5723,7 @@
               </w:rPr>
               <w:t>product_name</w:t>
             </w:r>
+            <w:proofErr w:type="spellEnd"/>
           </w:p>
         </w:tc>
         <w:tc>
@@ -5153,6 +5836,7 @@
             <w:pPr>
               <w:spacing w:before="40" w:after="40"/>
             </w:pPr>
+            <w:proofErr w:type="spellStart"/>
             <w:r>
               <w:rPr>
                 <w:rFonts w:ascii="Consolas" w:hAnsi="Consolas"/>
@@ -5161,6 +5845,7 @@
               </w:rPr>
               <w:t>sub_category</w:t>
             </w:r>
+            <w:proofErr w:type="spellEnd"/>
           </w:p>
         </w:tc>
         <w:tc>
@@ -5223,6 +5908,7 @@
         </w:rPr>
         <w:t xml:space="preserve"> Some </w:t>
       </w:r>
+      <w:proofErr w:type="spellStart"/>
       <w:r>
         <w:rPr>
           <w:rFonts w:ascii="Consolas" w:hAnsi="Consolas"/>
@@ -5235,13 +5921,14 @@
         <w:rPr>
           <w:sz w:val="20"/>
         </w:rPr>
-        <w:t xml:space="preserve">s carry several names in the source. Keying on the ID alone would merge </w:t>
-      </w:r>
+        <w:t>s</w:t>
+      </w:r>
+      <w:proofErr w:type="spellEnd"/>
       <w:r>
         <w:rPr>
           <w:sz w:val="20"/>
         </w:rPr>
-        <w:t>different products, or create duplicate dimension rows that fan out the fact join.</w:t>
+        <w:t xml:space="preserve"> carry several names in the source. Keying on the ID alone would merge different products, or create duplicate dimension rows that fan out the fact join.</w:t>
       </w:r>
     </w:p>
     <w:p>
@@ -5249,11 +5936,13 @@
         <w:pStyle w:val="Heading2"/>
       </w:pPr>
       <w:bookmarkStart w:id="12" w:name="_Toc241795019"/>
+      <w:proofErr w:type="spellStart"/>
       <w:r>
         <w:lastRenderedPageBreak/>
         <w:t>dim_location</w:t>
       </w:r>
       <w:bookmarkEnd w:id="12"/>
+      <w:proofErr w:type="spellEnd"/>
     </w:p>
     <w:p>
       <w:r>
@@ -5361,6 +6050,7 @@
               <w:keepNext/>
               <w:spacing w:before="40" w:after="40"/>
             </w:pPr>
+            <w:proofErr w:type="spellStart"/>
             <w:r>
               <w:rPr>
                 <w:rFonts w:ascii="Consolas" w:hAnsi="Consolas"/>
@@ -5369,6 +6059,7 @@
               </w:rPr>
               <w:t>geography_key</w:t>
             </w:r>
+            <w:proofErr w:type="spellEnd"/>
           </w:p>
         </w:tc>
         <w:tc>
@@ -5409,7 +6100,25 @@
                 <w:color w:val="C7254E"/>
                 <w:sz w:val="16"/>
               </w:rPr>
-              <w:t>md5(country | region | state | city | postal_code)</w:t>
+              <w:t xml:space="preserve">md5(country | region | state | city | </w:t>
+            </w:r>
+            <w:proofErr w:type="spellStart"/>
+            <w:r>
+              <w:rPr>
+                <w:rFonts w:ascii="Consolas" w:hAnsi="Consolas"/>
+                <w:color w:val="C7254E"/>
+                <w:sz w:val="16"/>
+              </w:rPr>
+              <w:t>postal_code</w:t>
+            </w:r>
+            <w:proofErr w:type="spellEnd"/>
+            <w:r>
+              <w:rPr>
+                <w:rFonts w:ascii="Consolas" w:hAnsi="Consolas"/>
+                <w:color w:val="C7254E"/>
+                <w:sz w:val="16"/>
+              </w:rPr>
+              <w:t>)</w:t>
             </w:r>
           </w:p>
         </w:tc>
@@ -5670,6 +6379,7 @@
             <w:pPr>
               <w:spacing w:before="40" w:after="40"/>
             </w:pPr>
+            <w:proofErr w:type="spellStart"/>
             <w:r>
               <w:rPr>
                 <w:rFonts w:ascii="Consolas" w:hAnsi="Consolas"/>
@@ -5678,6 +6388,7 @@
               </w:rPr>
               <w:t>postal_code</w:t>
             </w:r>
+            <w:proofErr w:type="spellEnd"/>
           </w:p>
         </w:tc>
         <w:tc>
@@ -5726,10 +6437,12 @@
         <w:pStyle w:val="Heading2"/>
       </w:pPr>
       <w:bookmarkStart w:id="13" w:name="_Toc241795020"/>
+      <w:proofErr w:type="spellStart"/>
       <w:r>
         <w:t>dim_date</w:t>
       </w:r>
       <w:bookmarkEnd w:id="13"/>
+      <w:proofErr w:type="spellEnd"/>
     </w:p>
     <w:p>
       <w:r>
@@ -5837,6 +6550,7 @@
               <w:keepNext/>
               <w:spacing w:before="40" w:after="40"/>
             </w:pPr>
+            <w:proofErr w:type="spellStart"/>
             <w:r>
               <w:rPr>
                 <w:rFonts w:ascii="Consolas" w:hAnsi="Consolas"/>
@@ -5845,6 +6559,7 @@
               </w:rPr>
               <w:t>date_key</w:t>
             </w:r>
+            <w:proofErr w:type="spellEnd"/>
           </w:p>
         </w:tc>
         <w:tc>
@@ -5925,6 +6640,7 @@
               <w:keepNext/>
               <w:spacing w:before="40" w:after="40"/>
             </w:pPr>
+            <w:proofErr w:type="spellStart"/>
             <w:r>
               <w:rPr>
                 <w:rFonts w:ascii="Consolas" w:hAnsi="Consolas"/>
@@ -5933,6 +6649,7 @@
               </w:rPr>
               <w:t>date_day</w:t>
             </w:r>
+            <w:proofErr w:type="spellEnd"/>
           </w:p>
         </w:tc>
         <w:tc>
@@ -6005,12 +6722,14 @@
               <w:keepNext/>
               <w:spacing w:before="40" w:after="40"/>
             </w:pPr>
+            <w:proofErr w:type="spellStart"/>
             <w:r>
               <w:rPr>
                 <w:sz w:val="18"/>
               </w:rPr>
               <w:t>bigint</w:t>
             </w:r>
+            <w:proofErr w:type="spellEnd"/>
           </w:p>
         </w:tc>
         <w:tc>
@@ -6066,12 +6785,14 @@
               <w:keepNext/>
               <w:spacing w:before="40" w:after="40"/>
             </w:pPr>
+            <w:proofErr w:type="spellStart"/>
             <w:r>
               <w:rPr>
                 <w:sz w:val="18"/>
               </w:rPr>
               <w:t>bigint</w:t>
             </w:r>
+            <w:proofErr w:type="spellEnd"/>
           </w:p>
         </w:tc>
         <w:tc>
@@ -6126,12 +6847,14 @@
               <w:keepNext/>
               <w:spacing w:before="40" w:after="40"/>
             </w:pPr>
+            <w:proofErr w:type="spellStart"/>
             <w:r>
               <w:rPr>
                 <w:sz w:val="18"/>
               </w:rPr>
               <w:t>bigint</w:t>
             </w:r>
+            <w:proofErr w:type="spellEnd"/>
           </w:p>
         </w:tc>
         <w:tc>
@@ -6167,6 +6890,7 @@
               <w:keepNext/>
               <w:spacing w:before="40" w:after="40"/>
             </w:pPr>
+            <w:proofErr w:type="spellStart"/>
             <w:r>
               <w:rPr>
                 <w:rFonts w:ascii="Consolas" w:hAnsi="Consolas"/>
@@ -6175,6 +6899,7 @@
               </w:rPr>
               <w:t>month_name</w:t>
             </w:r>
+            <w:proofErr w:type="spellEnd"/>
           </w:p>
         </w:tc>
         <w:tc>
@@ -6236,6 +6961,7 @@
               <w:keepNext/>
               <w:spacing w:before="40" w:after="40"/>
             </w:pPr>
+            <w:proofErr w:type="spellStart"/>
             <w:r>
               <w:rPr>
                 <w:rFonts w:ascii="Consolas" w:hAnsi="Consolas"/>
@@ -6244,6 +6970,7 @@
               </w:rPr>
               <w:t>day_of_month</w:t>
             </w:r>
+            <w:proofErr w:type="spellEnd"/>
           </w:p>
         </w:tc>
         <w:tc>
@@ -6255,12 +6982,14 @@
               <w:keepNext/>
               <w:spacing w:before="40" w:after="40"/>
             </w:pPr>
+            <w:proofErr w:type="spellStart"/>
             <w:r>
               <w:rPr>
                 <w:sz w:val="18"/>
               </w:rPr>
               <w:t>bigint</w:t>
             </w:r>
+            <w:proofErr w:type="spellEnd"/>
           </w:p>
         </w:tc>
         <w:tc>
@@ -6296,6 +7025,7 @@
               <w:keepNext/>
               <w:spacing w:before="40" w:after="40"/>
             </w:pPr>
+            <w:proofErr w:type="spellStart"/>
             <w:r>
               <w:rPr>
                 <w:rFonts w:ascii="Consolas" w:hAnsi="Consolas"/>
@@ -6304,6 +7034,7 @@
               </w:rPr>
               <w:t>day_name</w:t>
             </w:r>
+            <w:proofErr w:type="spellEnd"/>
           </w:p>
         </w:tc>
         <w:tc>
@@ -6364,6 +7095,7 @@
             <w:pPr>
               <w:spacing w:before="40" w:after="40"/>
             </w:pPr>
+            <w:proofErr w:type="spellStart"/>
             <w:r>
               <w:rPr>
                 <w:rFonts w:ascii="Consolas" w:hAnsi="Consolas"/>
@@ -6372,6 +7104,7 @@
               </w:rPr>
               <w:t>is_weekend</w:t>
             </w:r>
+            <w:proofErr w:type="spellEnd"/>
           </w:p>
         </w:tc>
         <w:tc>
@@ -6382,12 +7115,14 @@
             <w:pPr>
               <w:spacing w:before="40" w:after="40"/>
             </w:pPr>
+            <w:proofErr w:type="spellStart"/>
             <w:r>
               <w:rPr>
                 <w:sz w:val="18"/>
               </w:rPr>
               <w:t>boolean</w:t>
             </w:r>
+            <w:proofErr w:type="spellEnd"/>
           </w:p>
         </w:tc>
         <w:tc>
@@ -6422,6 +7157,7 @@
       </w:pPr>
     </w:p>
     <w:p>
+      <w:proofErr w:type="spellStart"/>
       <w:r>
         <w:rPr>
           <w:rFonts w:ascii="Consolas" w:hAnsi="Consolas"/>
@@ -6430,6 +7166,7 @@
         </w:rPr>
         <w:t>dim_date</w:t>
       </w:r>
+      <w:proofErr w:type="spellEnd"/>
       <w:r>
         <w:t xml:space="preserve"> is a </w:t>
       </w:r>
@@ -6442,6 +7179,7 @@
       <w:r>
         <w:t xml:space="preserve">: </w:t>
       </w:r>
+      <w:proofErr w:type="spellStart"/>
       <w:r>
         <w:rPr>
           <w:rFonts w:ascii="Consolas" w:hAnsi="Consolas"/>
@@ -6450,6 +7188,7 @@
         </w:rPr>
         <w:t>fact_orders</w:t>
       </w:r>
+      <w:proofErr w:type="spellEnd"/>
       <w:r>
         <w:t xml:space="preserve"> joins to it twice, once as order date and once as ship date.</w:t>
       </w:r>
@@ -6477,7 +7216,7 @@
       <w:r>
         <w:t xml:space="preserve"> </w:t>
       </w:r>
-      <w:hyperlink r:id="rId12">
+      <w:hyperlink r:id="rId11">
         <w:r>
           <w:rPr>
             <w:rFonts w:ascii="Consolas" w:hAnsi="Consolas" w:cs="Consolas"/>
@@ -6568,6 +7307,7 @@
               <w:keepNext/>
               <w:spacing w:before="40" w:after="40"/>
             </w:pPr>
+            <w:proofErr w:type="spellStart"/>
             <w:r>
               <w:rPr>
                 <w:rFonts w:ascii="Consolas" w:hAnsi="Consolas"/>
@@ -6576,6 +7316,7 @@
               </w:rPr>
               <w:t>dag_id</w:t>
             </w:r>
+            <w:proofErr w:type="spellEnd"/>
           </w:p>
         </w:tc>
         <w:tc>
@@ -6587,6 +7328,7 @@
               <w:keepNext/>
               <w:spacing w:before="40" w:after="40"/>
             </w:pPr>
+            <w:proofErr w:type="spellStart"/>
             <w:r>
               <w:rPr>
                 <w:rFonts w:ascii="Consolas" w:hAnsi="Consolas"/>
@@ -6595,6 +7337,7 @@
               </w:rPr>
               <w:t>superstore_dwh</w:t>
             </w:r>
+            <w:proofErr w:type="spellEnd"/>
           </w:p>
         </w:tc>
       </w:tr>
@@ -6658,6 +7401,7 @@
               <w:keepNext/>
               <w:spacing w:before="40" w:after="40"/>
             </w:pPr>
+            <w:proofErr w:type="spellStart"/>
             <w:r>
               <w:rPr>
                 <w:rFonts w:ascii="Consolas" w:hAnsi="Consolas"/>
@@ -6666,6 +7410,7 @@
               </w:rPr>
               <w:t>start_date</w:t>
             </w:r>
+            <w:proofErr w:type="spellEnd"/>
           </w:p>
         </w:tc>
         <w:tc>
@@ -6857,14 +7602,88 @@
         <w:spacing w:before="120" w:line="240" w:lineRule="auto"/>
         <w:ind w:left="113"/>
       </w:pPr>
+      <w:proofErr w:type="spellStart"/>
       <w:r>
         <w:rPr>
           <w:rFonts w:ascii="Consolas" w:eastAsia="Consolas" w:hAnsi="Consolas"/>
           <w:color w:val="24292E"/>
           <w:sz w:val="17"/>
         </w:rPr>
-        <w:t>dbt_debug → load_to_ods → dbt_test_sources → dbt_run → dbt_test</w:t>
-      </w:r>
+        <w:t>dbt_debug</w:t>
+      </w:r>
+      <w:proofErr w:type="spellEnd"/>
+      <w:r>
+        <w:rPr>
+          <w:rFonts w:ascii="Consolas" w:eastAsia="Consolas" w:hAnsi="Consolas"/>
+          <w:color w:val="24292E"/>
+          <w:sz w:val="17"/>
+        </w:rPr>
+        <w:t xml:space="preserve"> → </w:t>
+      </w:r>
+      <w:proofErr w:type="spellStart"/>
+      <w:r>
+        <w:rPr>
+          <w:rFonts w:ascii="Consolas" w:eastAsia="Consolas" w:hAnsi="Consolas"/>
+          <w:color w:val="24292E"/>
+          <w:sz w:val="17"/>
+        </w:rPr>
+        <w:t>load_to_ods</w:t>
+      </w:r>
+      <w:proofErr w:type="spellEnd"/>
+      <w:r>
+        <w:rPr>
+          <w:rFonts w:ascii="Consolas" w:eastAsia="Consolas" w:hAnsi="Consolas"/>
+          <w:color w:val="24292E"/>
+          <w:sz w:val="17"/>
+        </w:rPr>
+        <w:t xml:space="preserve"> → </w:t>
+      </w:r>
+      <w:proofErr w:type="spellStart"/>
+      <w:r>
+        <w:rPr>
+          <w:rFonts w:ascii="Consolas" w:eastAsia="Consolas" w:hAnsi="Consolas"/>
+          <w:color w:val="24292E"/>
+          <w:sz w:val="17"/>
+        </w:rPr>
+        <w:t>dbt_test_sources</w:t>
+      </w:r>
+      <w:proofErr w:type="spellEnd"/>
+      <w:r>
+        <w:rPr>
+          <w:rFonts w:ascii="Consolas" w:eastAsia="Consolas" w:hAnsi="Consolas"/>
+          <w:color w:val="24292E"/>
+          <w:sz w:val="17"/>
+        </w:rPr>
+        <w:t xml:space="preserve"> → </w:t>
+      </w:r>
+      <w:proofErr w:type="spellStart"/>
+      <w:r>
+        <w:rPr>
+          <w:rFonts w:ascii="Consolas" w:eastAsia="Consolas" w:hAnsi="Consolas"/>
+          <w:color w:val="24292E"/>
+          <w:sz w:val="17"/>
+        </w:rPr>
+        <w:t>dbt_run</w:t>
+      </w:r>
+      <w:proofErr w:type="spellEnd"/>
+      <w:r>
+        <w:rPr>
+          <w:rFonts w:ascii="Consolas" w:eastAsia="Consolas" w:hAnsi="Consolas"/>
+          <w:color w:val="24292E"/>
+          <w:sz w:val="17"/>
+        </w:rPr>
+        <w:t xml:space="preserve"> → </w:t>
+      </w:r>
+      <w:proofErr w:type="spellStart"/>
+      <w:r>
+        <w:rPr>
+          <w:rFonts w:ascii="Consolas" w:eastAsia="Consolas" w:hAnsi="Consolas"/>
+          <w:color w:val="24292E"/>
+          <w:sz w:val="17"/>
+        </w:rPr>
+        <w:t>dbt_test</w:t>
+      </w:r>
+      <w:proofErr w:type="spellEnd"/>
     </w:p>
     <w:tbl>
       <w:tblPr>
@@ -7006,6 +7825,7 @@
               <w:keepNext/>
               <w:spacing w:before="40" w:after="40"/>
             </w:pPr>
+            <w:proofErr w:type="spellStart"/>
             <w:r>
               <w:rPr>
                 <w:rFonts w:ascii="Consolas" w:hAnsi="Consolas"/>
@@ -7014,6 +7834,7 @@
               </w:rPr>
               <w:t>dbt_debug</w:t>
             </w:r>
+            <w:proofErr w:type="spellEnd"/>
           </w:p>
         </w:tc>
         <w:tc>
@@ -7025,21 +7846,23 @@
               <w:keepNext/>
               <w:spacing w:before="40" w:after="40"/>
             </w:pPr>
+            <w:proofErr w:type="spellStart"/>
             <w:r>
               <w:rPr>
                 <w:rFonts w:ascii="Consolas" w:hAnsi="Consolas"/>
                 <w:color w:val="C7254E"/>
                 <w:sz w:val="16"/>
               </w:rPr>
-              <w:t xml:space="preserve">dbt </w:t>
-            </w:r>
+              <w:t>dbt</w:t>
+            </w:r>
+            <w:proofErr w:type="spellEnd"/>
             <w:r>
               <w:rPr>
                 <w:rFonts w:ascii="Consolas" w:hAnsi="Consolas"/>
                 <w:color w:val="C7254E"/>
                 <w:sz w:val="16"/>
               </w:rPr>
-              <w:t>debug</w:t>
+              <w:t xml:space="preserve"> debug</w:t>
             </w:r>
           </w:p>
         </w:tc>
@@ -7094,6 +7917,7 @@
               <w:keepNext/>
               <w:spacing w:before="40" w:after="40"/>
             </w:pPr>
+            <w:proofErr w:type="spellStart"/>
             <w:r>
               <w:rPr>
                 <w:rFonts w:ascii="Consolas" w:hAnsi="Consolas"/>
@@ -7102,6 +7926,7 @@
               </w:rPr>
               <w:t>load_to_ods</w:t>
             </w:r>
+            <w:proofErr w:type="spellEnd"/>
           </w:p>
         </w:tc>
         <w:tc>
@@ -7174,6 +7999,7 @@
               <w:keepNext/>
               <w:spacing w:before="40" w:after="40"/>
             </w:pPr>
+            <w:proofErr w:type="spellStart"/>
             <w:r>
               <w:rPr>
                 <w:rFonts w:ascii="Consolas" w:hAnsi="Consolas"/>
@@ -7182,6 +8008,7 @@
               </w:rPr>
               <w:t>dbt_test_sources</w:t>
             </w:r>
+            <w:proofErr w:type="spellEnd"/>
           </w:p>
         </w:tc>
         <w:tc>
@@ -7193,13 +8020,41 @@
               <w:keepNext/>
               <w:spacing w:before="40" w:after="40"/>
             </w:pPr>
+            <w:proofErr w:type="spellStart"/>
             <w:r>
               <w:rPr>
                 <w:rFonts w:ascii="Consolas" w:hAnsi="Consolas"/>
                 <w:color w:val="C7254E"/>
                 <w:sz w:val="16"/>
               </w:rPr>
-              <w:t>dbt test --select source:ods --indirect-selection cautious</w:t>
+              <w:t>dbt</w:t>
+            </w:r>
+            <w:proofErr w:type="spellEnd"/>
+            <w:r>
+              <w:rPr>
+                <w:rFonts w:ascii="Consolas" w:hAnsi="Consolas"/>
+                <w:color w:val="C7254E"/>
+                <w:sz w:val="16"/>
+              </w:rPr>
+              <w:t xml:space="preserve"> test --select </w:t>
+            </w:r>
+            <w:proofErr w:type="spellStart"/>
+            <w:r>
+              <w:rPr>
+                <w:rFonts w:ascii="Consolas" w:hAnsi="Consolas"/>
+                <w:color w:val="C7254E"/>
+                <w:sz w:val="16"/>
+              </w:rPr>
+              <w:t>source:ods</w:t>
+            </w:r>
+            <w:proofErr w:type="spellEnd"/>
+            <w:r>
+              <w:rPr>
+                <w:rFonts w:ascii="Consolas" w:hAnsi="Consolas"/>
+                <w:color w:val="C7254E"/>
+                <w:sz w:val="16"/>
+              </w:rPr>
+              <w:t xml:space="preserve"> --indirect-selection cautious</w:t>
             </w:r>
           </w:p>
         </w:tc>
@@ -7254,6 +8109,7 @@
               <w:keepNext/>
               <w:spacing w:before="40" w:after="40"/>
             </w:pPr>
+            <w:proofErr w:type="spellStart"/>
             <w:r>
               <w:rPr>
                 <w:rFonts w:ascii="Consolas" w:hAnsi="Consolas"/>
@@ -7262,6 +8118,7 @@
               </w:rPr>
               <w:t>dbt_run</w:t>
             </w:r>
+            <w:proofErr w:type="spellEnd"/>
           </w:p>
         </w:tc>
         <w:tc>
@@ -7274,13 +8131,23 @@
               <w:keepNext/>
               <w:spacing w:before="40" w:after="40"/>
             </w:pPr>
+            <w:proofErr w:type="spellStart"/>
             <w:r>
               <w:rPr>
                 <w:rFonts w:ascii="Consolas" w:hAnsi="Consolas"/>
                 <w:color w:val="C7254E"/>
                 <w:sz w:val="16"/>
               </w:rPr>
-              <w:t>dbt run</w:t>
+              <w:t>dbt</w:t>
+            </w:r>
+            <w:proofErr w:type="spellEnd"/>
+            <w:r>
+              <w:rPr>
+                <w:rFonts w:ascii="Consolas" w:hAnsi="Consolas"/>
+                <w:color w:val="C7254E"/>
+                <w:sz w:val="16"/>
+              </w:rPr>
+              <w:t xml:space="preserve"> run</w:t>
             </w:r>
           </w:p>
         </w:tc>
@@ -7298,13 +8165,7 @@
               <w:rPr>
                 <w:sz w:val="18"/>
               </w:rPr>
-              <w:t xml:space="preserve">A model </w:t>
-            </w:r>
-            <w:r>
-              <w:rPr>
-                <w:sz w:val="18"/>
-              </w:rPr>
-              <w:t>has a SQL error</w:t>
+              <w:t>A model has a SQL error</w:t>
             </w:r>
           </w:p>
         </w:tc>
@@ -7338,6 +8199,7 @@
             <w:pPr>
               <w:spacing w:before="40" w:after="40"/>
             </w:pPr>
+            <w:proofErr w:type="spellStart"/>
             <w:r>
               <w:rPr>
                 <w:rFonts w:ascii="Consolas" w:hAnsi="Consolas"/>
@@ -7346,6 +8208,7 @@
               </w:rPr>
               <w:t>dbt_test</w:t>
             </w:r>
+            <w:proofErr w:type="spellEnd"/>
           </w:p>
         </w:tc>
         <w:tc>
@@ -7356,13 +8219,23 @@
             <w:pPr>
               <w:spacing w:before="40" w:after="40"/>
             </w:pPr>
+            <w:proofErr w:type="spellStart"/>
             <w:r>
               <w:rPr>
                 <w:rFonts w:ascii="Consolas" w:hAnsi="Consolas"/>
                 <w:color w:val="C7254E"/>
                 <w:sz w:val="16"/>
               </w:rPr>
-              <w:t>dbt test</w:t>
+              <w:t>dbt</w:t>
+            </w:r>
+            <w:proofErr w:type="spellEnd"/>
+            <w:r>
+              <w:rPr>
+                <w:rFonts w:ascii="Consolas" w:hAnsi="Consolas"/>
+                <w:color w:val="C7254E"/>
+                <w:sz w:val="16"/>
+              </w:rPr>
+              <w:t xml:space="preserve"> test</w:t>
             </w:r>
           </w:p>
         </w:tc>
@@ -7391,7 +8264,15 @@
     </w:p>
     <w:p>
       <w:r>
-        <w:t xml:space="preserve">Every dbt command runs from </w:t>
+        <w:t xml:space="preserve">Every </w:t>
+      </w:r>
+      <w:proofErr w:type="spellStart"/>
+      <w:r>
+        <w:t>dbt</w:t>
+      </w:r>
+      <w:proofErr w:type="spellEnd"/>
+      <w:r>
+        <w:t xml:space="preserve"> command runs from </w:t>
       </w:r>
       <w:r>
         <w:rPr>
@@ -7399,22 +8280,61 @@
           <w:color w:val="C7254E"/>
           <w:sz w:val="19"/>
         </w:rPr>
-        <w:t>/opt/airflow/project/my_project</w:t>
-      </w:r>
-      <w:r>
-        <w:t xml:space="preserve"> with </w:t>
-      </w:r>
+        <w:t>/opt/airflow/project/</w:t>
+      </w:r>
+      <w:proofErr w:type="spellStart"/>
       <w:r>
         <w:rPr>
           <w:rFonts w:ascii="Consolas" w:hAnsi="Consolas"/>
           <w:color w:val="C7254E"/>
           <w:sz w:val="19"/>
         </w:rPr>
-        <w:t>--profiles-dir . --target dev</w:t>
+        <w:t>my_project</w:t>
+      </w:r>
+      <w:proofErr w:type="spellEnd"/>
+      <w:r>
+        <w:t xml:space="preserve"> with </w:t>
+      </w:r>
+      <w:r>
+        <w:rPr>
+          <w:rFonts w:ascii="Consolas" w:hAnsi="Consolas"/>
+          <w:color w:val="C7254E"/>
+          <w:sz w:val="19"/>
+        </w:rPr>
+        <w:t>--profiles-</w:t>
+      </w:r>
+      <w:proofErr w:type="spellStart"/>
+      <w:proofErr w:type="gramStart"/>
+      <w:r>
+        <w:rPr>
+          <w:rFonts w:ascii="Consolas" w:hAnsi="Consolas"/>
+          <w:color w:val="C7254E"/>
+          <w:sz w:val="19"/>
+        </w:rPr>
+        <w:t>dir</w:t>
+      </w:r>
+      <w:proofErr w:type="spellEnd"/>
+      <w:r>
+        <w:rPr>
+          <w:rFonts w:ascii="Consolas" w:hAnsi="Consolas"/>
+          <w:color w:val="C7254E"/>
+          <w:sz w:val="19"/>
+        </w:rPr>
+        <w:t xml:space="preserve"> .</w:t>
+      </w:r>
+      <w:proofErr w:type="gramEnd"/>
+      <w:r>
+        <w:rPr>
+          <w:rFonts w:ascii="Consolas" w:hAnsi="Consolas"/>
+          <w:color w:val="C7254E"/>
+          <w:sz w:val="19"/>
+        </w:rPr>
+        <w:t xml:space="preserve"> --target dev</w:t>
       </w:r>
       <w:r>
         <w:t xml:space="preserve">, so the project uses its own committed </w:t>
       </w:r>
+      <w:proofErr w:type="spellStart"/>
       <w:r>
         <w:rPr>
           <w:rFonts w:ascii="Consolas" w:hAnsi="Consolas"/>
@@ -7423,6 +8343,7 @@
         </w:rPr>
         <w:t>profiles.yml</w:t>
       </w:r>
+      <w:proofErr w:type="spellEnd"/>
       <w:r>
         <w:t>.</w:t>
       </w:r>
@@ -7450,21 +8371,52 @@
         <w:t>--no-partial-parse</w:t>
       </w:r>
       <w:r>
-        <w:t xml:space="preserve"> makes dbt re-parse the project on every run. </w:t>
-      </w:r>
+        <w:t xml:space="preserve"> makes </w:t>
+      </w:r>
+      <w:proofErr w:type="spellStart"/>
+      <w:r>
+        <w:t>dbt</w:t>
+      </w:r>
+      <w:proofErr w:type="spellEnd"/>
+      <w:r>
+        <w:t xml:space="preserve"> re-parse the project on every run. </w:t>
+      </w:r>
+      <w:proofErr w:type="spellStart"/>
       <w:r>
         <w:rPr>
           <w:rFonts w:ascii="Consolas" w:hAnsi="Consolas"/>
           <w:color w:val="C7254E"/>
           <w:sz w:val="19"/>
         </w:rPr>
-        <w:t>my_project/target/</w:t>
-      </w:r>
-      <w:r>
-        <w:t xml:space="preserve"> is shared with the host through the volume mount, and a parse cache written </w:t>
-      </w:r>
-      <w:r>
-        <w:t>by dbt on Windows contains Windows paths that crash dbt on Linux.</w:t>
+        <w:t>my_project</w:t>
+      </w:r>
+      <w:proofErr w:type="spellEnd"/>
+      <w:r>
+        <w:rPr>
+          <w:rFonts w:ascii="Consolas" w:hAnsi="Consolas"/>
+          <w:color w:val="C7254E"/>
+          <w:sz w:val="19"/>
+        </w:rPr>
+        <w:t>/target/</w:t>
+      </w:r>
+      <w:r>
+        <w:t xml:space="preserve"> is shared with the host through the volume mount, and a parse cache written by </w:t>
+      </w:r>
+      <w:proofErr w:type="spellStart"/>
+      <w:r>
+        <w:t>dbt</w:t>
+      </w:r>
+      <w:proofErr w:type="spellEnd"/>
+      <w:r>
+        <w:t xml:space="preserve"> on Windows contains Windows paths that crash </w:t>
+      </w:r>
+      <w:proofErr w:type="spellStart"/>
+      <w:r>
+        <w:t>dbt</w:t>
+      </w:r>
+      <w:proofErr w:type="spellEnd"/>
+      <w:r>
+        <w:t xml:space="preserve"> on Linux.</w:t>
       </w:r>
     </w:p>
     <w:p>
@@ -7493,7 +8445,7 @@
                     <pic:cNvPicPr/>
                   </pic:nvPicPr>
                   <pic:blipFill>
-                    <a:blip r:embed="rId13"/>
+                    <a:blip r:embed="rId12"/>
                     <a:stretch>
                       <a:fillRect/>
                     </a:stretch>
@@ -7527,6 +8479,7 @@
         </w:rPr>
         <w:t xml:space="preserve">Figure 2: a successful </w:t>
       </w:r>
+      <w:proofErr w:type="spellStart"/>
       <w:r>
         <w:rPr>
           <w:rFonts w:ascii="Consolas" w:hAnsi="Consolas"/>
@@ -7537,6 +8490,7 @@
         </w:rPr>
         <w:t>superstore_dwh</w:t>
       </w:r>
+      <w:proofErr w:type="spellEnd"/>
       <w:r>
         <w:rPr>
           <w:b w:val="0"/>
@@ -7569,6 +8523,7 @@
       <w:r>
         <w:t xml:space="preserve">, run by the </w:t>
       </w:r>
+      <w:proofErr w:type="spellStart"/>
       <w:r>
         <w:rPr>
           <w:rFonts w:ascii="Consolas" w:hAnsi="Consolas"/>
@@ -7577,6 +8532,7 @@
         </w:rPr>
         <w:t>dbt_test</w:t>
       </w:r>
+      <w:proofErr w:type="spellEnd"/>
       <w:r>
         <w:t xml:space="preserve"> task.</w:t>
       </w:r>
@@ -7682,6 +8638,7 @@
               <w:keepNext/>
               <w:spacing w:before="40" w:after="40"/>
             </w:pPr>
+            <w:proofErr w:type="spellStart"/>
             <w:r>
               <w:rPr>
                 <w:rFonts w:ascii="Consolas" w:hAnsi="Consolas"/>
@@ -7690,6 +8647,7 @@
               </w:rPr>
               <w:t>stg_superstore</w:t>
             </w:r>
+            <w:proofErr w:type="spellEnd"/>
           </w:p>
         </w:tc>
         <w:tc>
@@ -7701,6 +8659,7 @@
               <w:keepNext/>
               <w:spacing w:before="40" w:after="40"/>
             </w:pPr>
+            <w:proofErr w:type="spellStart"/>
             <w:r>
               <w:rPr>
                 <w:rFonts w:ascii="Consolas" w:hAnsi="Consolas"/>
@@ -7709,6 +8668,7 @@
               </w:rPr>
               <w:t>row_id</w:t>
             </w:r>
+            <w:proofErr w:type="spellEnd"/>
           </w:p>
         </w:tc>
         <w:tc>
@@ -7734,6 +8694,7 @@
               </w:rPr>
               <w:t xml:space="preserve">, </w:t>
             </w:r>
+            <w:proofErr w:type="spellStart"/>
             <w:r>
               <w:rPr>
                 <w:rFonts w:ascii="Consolas" w:hAnsi="Consolas"/>
@@ -7742,6 +8703,7 @@
               </w:rPr>
               <w:t>not_null</w:t>
             </w:r>
+            <w:proofErr w:type="spellEnd"/>
           </w:p>
         </w:tc>
       </w:tr>
@@ -7760,6 +8722,7 @@
               <w:keepNext/>
               <w:spacing w:before="40" w:after="40"/>
             </w:pPr>
+            <w:proofErr w:type="spellStart"/>
             <w:r>
               <w:rPr>
                 <w:rFonts w:ascii="Consolas" w:hAnsi="Consolas"/>
@@ -7768,6 +8731,7 @@
               </w:rPr>
               <w:t>stg_superstore</w:t>
             </w:r>
+            <w:proofErr w:type="spellEnd"/>
           </w:p>
         </w:tc>
         <w:tc>
@@ -7780,6 +8744,7 @@
               <w:keepNext/>
               <w:spacing w:before="40" w:after="40"/>
             </w:pPr>
+            <w:proofErr w:type="spellStart"/>
             <w:r>
               <w:rPr>
                 <w:rFonts w:ascii="Consolas" w:hAnsi="Consolas"/>
@@ -7788,12 +8753,14 @@
               </w:rPr>
               <w:t>order_id</w:t>
             </w:r>
+            <w:proofErr w:type="spellEnd"/>
             <w:r>
               <w:rPr>
                 <w:sz w:val="18"/>
               </w:rPr>
               <w:t xml:space="preserve">, </w:t>
             </w:r>
+            <w:proofErr w:type="spellStart"/>
             <w:r>
               <w:rPr>
                 <w:rFonts w:ascii="Consolas" w:hAnsi="Consolas"/>
@@ -7802,12 +8769,14 @@
               </w:rPr>
               <w:t>order_date</w:t>
             </w:r>
+            <w:proofErr w:type="spellEnd"/>
             <w:r>
               <w:rPr>
                 <w:sz w:val="18"/>
               </w:rPr>
               <w:t xml:space="preserve">, </w:t>
             </w:r>
+            <w:proofErr w:type="spellStart"/>
             <w:r>
               <w:rPr>
                 <w:rFonts w:ascii="Consolas" w:hAnsi="Consolas"/>
@@ -7816,12 +8785,14 @@
               </w:rPr>
               <w:t>customer_id</w:t>
             </w:r>
+            <w:proofErr w:type="spellEnd"/>
             <w:r>
               <w:rPr>
                 <w:sz w:val="18"/>
               </w:rPr>
               <w:t xml:space="preserve">, </w:t>
             </w:r>
+            <w:proofErr w:type="spellStart"/>
             <w:r>
               <w:rPr>
                 <w:rFonts w:ascii="Consolas" w:hAnsi="Consolas"/>
@@ -7830,6 +8801,7 @@
               </w:rPr>
               <w:t>product_id</w:t>
             </w:r>
+            <w:proofErr w:type="spellEnd"/>
             <w:r>
               <w:rPr>
                 <w:sz w:val="18"/>
@@ -7870,6 +8842,7 @@
               <w:keepNext/>
               <w:spacing w:before="40" w:after="40"/>
             </w:pPr>
+            <w:proofErr w:type="spellStart"/>
             <w:r>
               <w:rPr>
                 <w:rFonts w:ascii="Consolas" w:hAnsi="Consolas"/>
@@ -7878,6 +8851,7 @@
               </w:rPr>
               <w:t>not_null</w:t>
             </w:r>
+            <w:proofErr w:type="spellEnd"/>
           </w:p>
         </w:tc>
       </w:tr>
@@ -7895,6 +8869,7 @@
               <w:keepNext/>
               <w:spacing w:before="40" w:after="40"/>
             </w:pPr>
+            <w:proofErr w:type="spellStart"/>
             <w:r>
               <w:rPr>
                 <w:rFonts w:ascii="Consolas" w:hAnsi="Consolas"/>
@@ -7903,6 +8878,7 @@
               </w:rPr>
               <w:t>fact_orders</w:t>
             </w:r>
+            <w:proofErr w:type="spellEnd"/>
           </w:p>
         </w:tc>
         <w:tc>
@@ -7914,6 +8890,7 @@
               <w:keepNext/>
               <w:spacing w:before="40" w:after="40"/>
             </w:pPr>
+            <w:proofErr w:type="spellStart"/>
             <w:r>
               <w:rPr>
                 <w:rFonts w:ascii="Consolas" w:hAnsi="Consolas"/>
@@ -7922,6 +8899,7 @@
               </w:rPr>
               <w:t>sales_key</w:t>
             </w:r>
+            <w:proofErr w:type="spellEnd"/>
           </w:p>
         </w:tc>
         <w:tc>
@@ -7947,6 +8925,7 @@
               </w:rPr>
               <w:t xml:space="preserve">, </w:t>
             </w:r>
+            <w:proofErr w:type="spellStart"/>
             <w:r>
               <w:rPr>
                 <w:rFonts w:ascii="Consolas" w:hAnsi="Consolas"/>
@@ -7955,6 +8934,7 @@
               </w:rPr>
               <w:t>not_null</w:t>
             </w:r>
+            <w:proofErr w:type="spellEnd"/>
           </w:p>
         </w:tc>
       </w:tr>
@@ -7972,6 +8952,7 @@
             <w:pPr>
               <w:spacing w:before="40" w:after="40"/>
             </w:pPr>
+            <w:proofErr w:type="spellStart"/>
             <w:r>
               <w:rPr>
                 <w:rFonts w:ascii="Consolas" w:hAnsi="Consolas"/>
@@ -7980,6 +8961,7 @@
               </w:rPr>
               <w:t>fact_orders</w:t>
             </w:r>
+            <w:proofErr w:type="spellEnd"/>
           </w:p>
         </w:tc>
         <w:tc>
@@ -7991,6 +8973,7 @@
             <w:pPr>
               <w:spacing w:before="40" w:after="40"/>
             </w:pPr>
+            <w:proofErr w:type="spellStart"/>
             <w:r>
               <w:rPr>
                 <w:rFonts w:ascii="Consolas" w:hAnsi="Consolas"/>
@@ -7999,12 +8982,14 @@
               </w:rPr>
               <w:t>customer_key</w:t>
             </w:r>
+            <w:proofErr w:type="spellEnd"/>
             <w:r>
               <w:rPr>
                 <w:sz w:val="18"/>
               </w:rPr>
               <w:t xml:space="preserve">, </w:t>
             </w:r>
+            <w:proofErr w:type="spellStart"/>
             <w:r>
               <w:rPr>
                 <w:rFonts w:ascii="Consolas" w:hAnsi="Consolas"/>
@@ -8013,12 +8998,14 @@
               </w:rPr>
               <w:t>product_key</w:t>
             </w:r>
+            <w:proofErr w:type="spellEnd"/>
             <w:r>
               <w:rPr>
                 <w:sz w:val="18"/>
               </w:rPr>
               <w:t xml:space="preserve">, </w:t>
             </w:r>
+            <w:proofErr w:type="spellStart"/>
             <w:r>
               <w:rPr>
                 <w:rFonts w:ascii="Consolas" w:hAnsi="Consolas"/>
@@ -8027,12 +9014,14 @@
               </w:rPr>
               <w:t>geography_key</w:t>
             </w:r>
+            <w:proofErr w:type="spellEnd"/>
             <w:r>
               <w:rPr>
                 <w:sz w:val="18"/>
               </w:rPr>
               <w:t xml:space="preserve">, </w:t>
             </w:r>
+            <w:proofErr w:type="spellStart"/>
             <w:r>
               <w:rPr>
                 <w:rFonts w:ascii="Consolas" w:hAnsi="Consolas"/>
@@ -8041,12 +9030,14 @@
               </w:rPr>
               <w:t>order_date_key</w:t>
             </w:r>
+            <w:proofErr w:type="spellEnd"/>
             <w:r>
               <w:rPr>
                 <w:sz w:val="18"/>
               </w:rPr>
               <w:t xml:space="preserve">, </w:t>
             </w:r>
+            <w:proofErr w:type="spellStart"/>
             <w:r>
               <w:rPr>
                 <w:rFonts w:ascii="Consolas" w:hAnsi="Consolas"/>
@@ -8055,6 +9046,7 @@
               </w:rPr>
               <w:t>ship_date_key</w:t>
             </w:r>
+            <w:proofErr w:type="spellEnd"/>
           </w:p>
         </w:tc>
         <w:tc>
@@ -8066,6 +9058,7 @@
             <w:pPr>
               <w:spacing w:before="40" w:after="40"/>
             </w:pPr>
+            <w:proofErr w:type="spellStart"/>
             <w:r>
               <w:rPr>
                 <w:rFonts w:ascii="Consolas" w:hAnsi="Consolas"/>
@@ -8074,6 +9067,7 @@
               </w:rPr>
               <w:t>not_null</w:t>
             </w:r>
+            <w:proofErr w:type="spellEnd"/>
             <w:r>
               <w:rPr>
                 <w:sz w:val="18"/>
@@ -8112,6 +9106,7 @@
       <w:r>
         <w:t xml:space="preserve"> and </w:t>
       </w:r>
+      <w:proofErr w:type="spellStart"/>
       <w:r>
         <w:rPr>
           <w:rFonts w:ascii="Consolas" w:hAnsi="Consolas"/>
@@ -8120,6 +9115,7 @@
         </w:rPr>
         <w:t>not_null</w:t>
       </w:r>
+      <w:proofErr w:type="spellEnd"/>
       <w:r>
         <w:t xml:space="preserve"> tests on the fact table guarantee that </w:t>
       </w:r>
@@ -8136,10 +9132,15 @@
     <w:p>
       <w:r>
         <w:lastRenderedPageBreak/>
-        <w:t>Tests appear in dbt d</w:t>
-      </w:r>
-      <w:r>
-        <w:t>ocs next to each column (</w:t>
+        <w:t xml:space="preserve">Tests appear in </w:t>
+      </w:r>
+      <w:proofErr w:type="spellStart"/>
+      <w:r>
+        <w:t>dbt</w:t>
+      </w:r>
+      <w:proofErr w:type="spellEnd"/>
+      <w:r>
+        <w:t xml:space="preserve"> docs next to each column (</w:t>
       </w:r>
       <w:r>
         <w:rPr>
@@ -8157,7 +9158,15 @@
         <w:t>N</w:t>
       </w:r>
       <w:r>
-        <w:t xml:space="preserve"> = not_null, </w:t>
+        <w:t xml:space="preserve"> = </w:t>
+      </w:r>
+      <w:proofErr w:type="spellStart"/>
+      <w:r>
+        <w:t>not_null</w:t>
+      </w:r>
+      <w:proofErr w:type="spellEnd"/>
+      <w:r>
+        <w:t xml:space="preserve">, </w:t>
       </w:r>
       <w:r>
         <w:rPr>
@@ -8195,7 +9204,7 @@
                     <pic:cNvPicPr/>
                   </pic:nvPicPr>
                   <pic:blipFill>
-                    <a:blip r:embed="rId14"/>
+                    <a:blip r:embed="rId13"/>
                     <a:stretch>
                       <a:fillRect/>
                     </a:stretch>
@@ -8227,8 +9236,27 @@
           <w:i/>
           <w:color w:val="595959"/>
         </w:rPr>
-        <w:t xml:space="preserve">Figure 3: the dbt docs page for </w:t>
-      </w:r>
+        <w:t xml:space="preserve">Figure 3: the </w:t>
+      </w:r>
+      <w:proofErr w:type="spellStart"/>
+      <w:r>
+        <w:rPr>
+          <w:b w:val="0"/>
+          <w:i/>
+          <w:color w:val="595959"/>
+        </w:rPr>
+        <w:t>dbt</w:t>
+      </w:r>
+      <w:proofErr w:type="spellEnd"/>
+      <w:r>
+        <w:rPr>
+          <w:b w:val="0"/>
+          <w:i/>
+          <w:color w:val="595959"/>
+        </w:rPr>
+        <w:t xml:space="preserve"> docs page for </w:t>
+      </w:r>
+      <w:proofErr w:type="spellStart"/>
       <w:r>
         <w:rPr>
           <w:rFonts w:ascii="Consolas" w:hAnsi="Consolas"/>
@@ -8239,6 +9267,7 @@
         </w:rPr>
         <w:t>fact_orders</w:t>
       </w:r>
+      <w:proofErr w:type="spellEnd"/>
       <w:r>
         <w:rPr>
           <w:b w:val="0"/>
@@ -8247,6 +9276,8 @@
         </w:rPr>
         <w:t xml:space="preserve">, showing that it is built in </w:t>
       </w:r>
+      <w:proofErr w:type="spellStart"/>
+      <w:proofErr w:type="gramStart"/>
       <w:r>
         <w:rPr>
           <w:rFonts w:ascii="Consolas" w:hAnsi="Consolas"/>
@@ -8255,8 +9286,20 @@
           <w:color w:val="C7254E"/>
           <w:sz w:val="16"/>
         </w:rPr>
-        <w:t>dev.main_dwh</w:t>
-      </w:r>
+        <w:t>dev.main</w:t>
+      </w:r>
+      <w:proofErr w:type="gramEnd"/>
+      <w:r>
+        <w:rPr>
+          <w:rFonts w:ascii="Consolas" w:hAnsi="Consolas"/>
+          <w:b w:val="0"/>
+          <w:i/>
+          <w:color w:val="C7254E"/>
+          <w:sz w:val="16"/>
+        </w:rPr>
+        <w:t>_dwh</w:t>
+      </w:r>
+      <w:proofErr w:type="spellEnd"/>
       <w:r>
         <w:rPr>
           <w:b w:val="0"/>
@@ -8289,8 +9332,18 @@
           <w:color w:val="24292E"/>
           <w:sz w:val="17"/>
         </w:rPr>
-        <w:t>cd my_project</w:t>
-      </w:r>
+        <w:t xml:space="preserve">cd </w:t>
+      </w:r>
+      <w:proofErr w:type="spellStart"/>
+      <w:r>
+        <w:rPr>
+          <w:rFonts w:ascii="Consolas" w:eastAsia="Consolas" w:hAnsi="Consolas"/>
+          <w:color w:val="24292E"/>
+          <w:sz w:val="17"/>
+        </w:rPr>
+        <w:t>my_project</w:t>
+      </w:r>
+      <w:proofErr w:type="spellEnd"/>
     </w:p>
     <w:p>
       <w:pPr>
@@ -8303,21 +9356,51 @@
         <w:spacing w:after="0" w:line="240" w:lineRule="auto"/>
         <w:ind w:left="113"/>
       </w:pPr>
+      <w:proofErr w:type="spellStart"/>
       <w:r>
         <w:rPr>
           <w:rFonts w:ascii="Consolas" w:eastAsia="Consolas" w:hAnsi="Consolas"/>
           <w:color w:val="24292E"/>
           <w:sz w:val="17"/>
         </w:rPr>
-        <w:t xml:space="preserve">dbt </w:t>
-      </w:r>
+        <w:t>dbt</w:t>
+      </w:r>
+      <w:proofErr w:type="spellEnd"/>
       <w:r>
         <w:rPr>
           <w:rFonts w:ascii="Consolas" w:eastAsia="Consolas" w:hAnsi="Consolas"/>
           <w:color w:val="24292E"/>
           <w:sz w:val="17"/>
         </w:rPr>
-        <w:t>test --profiles-dir . --target dev                       # all tests</w:t>
+        <w:t xml:space="preserve"> test --profiles-</w:t>
+      </w:r>
+      <w:proofErr w:type="spellStart"/>
+      <w:proofErr w:type="gramStart"/>
+      <w:r>
+        <w:rPr>
+          <w:rFonts w:ascii="Consolas" w:eastAsia="Consolas" w:hAnsi="Consolas"/>
+          <w:color w:val="24292E"/>
+          <w:sz w:val="17"/>
+        </w:rPr>
+        <w:t>dir</w:t>
+      </w:r>
+      <w:proofErr w:type="spellEnd"/>
+      <w:r>
+        <w:rPr>
+          <w:rFonts w:ascii="Consolas" w:eastAsia="Consolas" w:hAnsi="Consolas"/>
+          <w:color w:val="24292E"/>
+          <w:sz w:val="17"/>
+        </w:rPr>
+        <w:t xml:space="preserve"> .</w:t>
+      </w:r>
+      <w:proofErr w:type="gramEnd"/>
+      <w:r>
+        <w:rPr>
+          <w:rFonts w:ascii="Consolas" w:eastAsia="Consolas" w:hAnsi="Consolas"/>
+          <w:color w:val="24292E"/>
+          <w:sz w:val="17"/>
+        </w:rPr>
+        <w:t xml:space="preserve"> --target dev                       # all tests</w:t>
       </w:r>
     </w:p>
     <w:p>
@@ -8331,13 +9414,87 @@
         <w:spacing w:line="240" w:lineRule="auto"/>
         <w:ind w:left="113"/>
       </w:pPr>
+      <w:proofErr w:type="spellStart"/>
       <w:r>
         <w:rPr>
           <w:rFonts w:ascii="Consolas" w:eastAsia="Consolas" w:hAnsi="Consolas"/>
           <w:color w:val="24292E"/>
           <w:sz w:val="17"/>
         </w:rPr>
-        <w:t>dbt test --profiles-dir . --target dev --select fact_orders  # one model</w:t>
+        <w:t>dbt</w:t>
+      </w:r>
+      <w:proofErr w:type="spellEnd"/>
+      <w:r>
+        <w:rPr>
+          <w:rFonts w:ascii="Consolas" w:eastAsia="Consolas" w:hAnsi="Consolas"/>
+          <w:color w:val="24292E"/>
+          <w:sz w:val="17"/>
+        </w:rPr>
+        <w:t xml:space="preserve"> test --profiles-</w:t>
+      </w:r>
+      <w:proofErr w:type="spellStart"/>
+      <w:proofErr w:type="gramStart"/>
+      <w:r>
+        <w:rPr>
+          <w:rFonts w:ascii="Consolas" w:eastAsia="Consolas" w:hAnsi="Consolas"/>
+          <w:color w:val="24292E"/>
+          <w:sz w:val="17"/>
+        </w:rPr>
+        <w:t>dir</w:t>
+      </w:r>
+      <w:proofErr w:type="spellEnd"/>
+      <w:r>
+        <w:rPr>
+          <w:rFonts w:ascii="Consolas" w:eastAsia="Consolas" w:hAnsi="Consolas"/>
+          <w:color w:val="24292E"/>
+          <w:sz w:val="17"/>
+        </w:rPr>
+        <w:t xml:space="preserve"> .</w:t>
+      </w:r>
+      <w:proofErr w:type="gramEnd"/>
+      <w:r>
+        <w:rPr>
+          <w:rFonts w:ascii="Consolas" w:eastAsia="Consolas" w:hAnsi="Consolas"/>
+          <w:color w:val="24292E"/>
+          <w:sz w:val="17"/>
+        </w:rPr>
+        <w:t xml:space="preserve"> --target dev --select </w:t>
+      </w:r>
+      <w:proofErr w:type="spellStart"/>
+      <w:r>
+        <w:rPr>
+          <w:rFonts w:ascii="Consolas" w:eastAsia="Consolas" w:hAnsi="Consolas"/>
+          <w:color w:val="24292E"/>
+          <w:sz w:val="17"/>
+        </w:rPr>
+        <w:t>fact_</w:t>
+      </w:r>
+      <w:proofErr w:type="gramStart"/>
+      <w:r>
+        <w:rPr>
+          <w:rFonts w:ascii="Consolas" w:eastAsia="Consolas" w:hAnsi="Consolas"/>
+          <w:color w:val="24292E"/>
+          <w:sz w:val="17"/>
+        </w:rPr>
+        <w:t>orders</w:t>
+      </w:r>
+      <w:proofErr w:type="spellEnd"/>
+      <w:r>
+        <w:rPr>
+          <w:rFonts w:ascii="Consolas" w:eastAsia="Consolas" w:hAnsi="Consolas"/>
+          <w:color w:val="24292E"/>
+          <w:sz w:val="17"/>
+        </w:rPr>
+        <w:t xml:space="preserve">  #</w:t>
+      </w:r>
+      <w:proofErr w:type="gramEnd"/>
+      <w:r>
+        <w:rPr>
+          <w:rFonts w:ascii="Consolas" w:eastAsia="Consolas" w:hAnsi="Consolas"/>
+          <w:color w:val="24292E"/>
+          <w:sz w:val="17"/>
+        </w:rPr>
+        <w:t xml:space="preserve"> one model</w:t>
       </w:r>
     </w:p>
     <w:p>
@@ -8516,7 +9673,21 @@
               <w:rPr>
                 <w:sz w:val="18"/>
               </w:rPr>
-              <w:t xml:space="preserve"> (API server, scheduler, DAG processor and triggerer in one process)</w:t>
+              <w:t xml:space="preserve"> (API server, scheduler, DAG processor and </w:t>
+            </w:r>
+            <w:proofErr w:type="spellStart"/>
+            <w:r>
+              <w:rPr>
+                <w:sz w:val="18"/>
+              </w:rPr>
+              <w:t>triggerer</w:t>
+            </w:r>
+            <w:proofErr w:type="spellEnd"/>
+            <w:r>
+              <w:rPr>
+                <w:sz w:val="18"/>
+              </w:rPr>
+              <w:t xml:space="preserve"> in one process)</w:t>
             </w:r>
           </w:p>
         </w:tc>
@@ -8535,11 +9706,19 @@
               <w:keepNext/>
               <w:spacing w:before="40" w:after="40"/>
             </w:pPr>
-            <w:r>
-              <w:rPr>
-                <w:sz w:val="18"/>
-              </w:rPr>
-              <w:t>dbt runtime</w:t>
+            <w:proofErr w:type="spellStart"/>
+            <w:r>
+              <w:rPr>
+                <w:sz w:val="18"/>
+              </w:rPr>
+              <w:t>dbt</w:t>
+            </w:r>
+            <w:proofErr w:type="spellEnd"/>
+            <w:r>
+              <w:rPr>
+                <w:sz w:val="18"/>
+              </w:rPr>
+              <w:t xml:space="preserve"> runtime</w:t>
             </w:r>
           </w:p>
         </w:tc>
@@ -8556,7 +9735,21 @@
               <w:rPr>
                 <w:sz w:val="18"/>
               </w:rPr>
-              <w:t xml:space="preserve">Separate virtualenv at </w:t>
+              <w:t xml:space="preserve">Separate </w:t>
+            </w:r>
+            <w:proofErr w:type="spellStart"/>
+            <w:r>
+              <w:rPr>
+                <w:sz w:val="18"/>
+              </w:rPr>
+              <w:t>virtualenv</w:t>
+            </w:r>
+            <w:proofErr w:type="spellEnd"/>
+            <w:r>
+              <w:rPr>
+                <w:sz w:val="18"/>
+              </w:rPr>
+              <w:t xml:space="preserve"> at </w:t>
             </w:r>
             <w:r>
               <w:rPr>
@@ -8564,8 +9757,18 @@
                 <w:color w:val="C7254E"/>
                 <w:sz w:val="16"/>
               </w:rPr>
-              <w:t>/opt/dbt_venv</w:t>
-            </w:r>
+              <w:t>/opt/</w:t>
+            </w:r>
+            <w:proofErr w:type="spellStart"/>
+            <w:r>
+              <w:rPr>
+                <w:rFonts w:ascii="Consolas" w:hAnsi="Consolas"/>
+                <w:color w:val="C7254E"/>
+                <w:sz w:val="16"/>
+              </w:rPr>
+              <w:t>dbt_venv</w:t>
+            </w:r>
+            <w:proofErr w:type="spellEnd"/>
           </w:p>
         </w:tc>
       </w:tr>
@@ -8584,11 +9787,19 @@
               <w:keepNext/>
               <w:spacing w:before="40" w:after="40"/>
             </w:pPr>
-            <w:r>
-              <w:rPr>
-                <w:sz w:val="18"/>
-              </w:rPr>
-              <w:t>DuckDB extension</w:t>
+            <w:proofErr w:type="spellStart"/>
+            <w:r>
+              <w:rPr>
+                <w:sz w:val="18"/>
+              </w:rPr>
+              <w:t>DuckDB</w:t>
+            </w:r>
+            <w:proofErr w:type="spellEnd"/>
+            <w:r>
+              <w:rPr>
+                <w:sz w:val="18"/>
+              </w:rPr>
+              <w:t xml:space="preserve"> extension</w:t>
             </w:r>
           </w:p>
         </w:tc>
@@ -8788,27 +9999,47 @@
                 <w:color w:val="C7254E"/>
                 <w:sz w:val="16"/>
               </w:rPr>
-              <w:t>airflow/dags</w:t>
-            </w:r>
-          </w:p>
-        </w:tc>
-        <w:tc>
-          <w:tcPr>
-            <w:tcW w:w="3333" w:type="dxa"/>
-          </w:tcPr>
-          <w:p>
-            <w:pPr>
-              <w:keepNext/>
-              <w:spacing w:before="40" w:after="40"/>
-            </w:pPr>
+              <w:t>airflow/</w:t>
+            </w:r>
+            <w:proofErr w:type="spellStart"/>
             <w:r>
               <w:rPr>
                 <w:rFonts w:ascii="Consolas" w:hAnsi="Consolas"/>
                 <w:color w:val="C7254E"/>
                 <w:sz w:val="16"/>
               </w:rPr>
-              <w:t>/opt/airflow/dags</w:t>
-            </w:r>
+              <w:t>dags</w:t>
+            </w:r>
+            <w:proofErr w:type="spellEnd"/>
+          </w:p>
+        </w:tc>
+        <w:tc>
+          <w:tcPr>
+            <w:tcW w:w="3333" w:type="dxa"/>
+          </w:tcPr>
+          <w:p>
+            <w:pPr>
+              <w:keepNext/>
+              <w:spacing w:before="40" w:after="40"/>
+            </w:pPr>
+            <w:r>
+              <w:rPr>
+                <w:rFonts w:ascii="Consolas" w:hAnsi="Consolas"/>
+                <w:color w:val="C7254E"/>
+                <w:sz w:val="16"/>
+              </w:rPr>
+              <w:t>/opt/airflow/</w:t>
+            </w:r>
+            <w:proofErr w:type="spellStart"/>
+            <w:r>
+              <w:rPr>
+                <w:rFonts w:ascii="Consolas" w:hAnsi="Consolas"/>
+                <w:color w:val="C7254E"/>
+                <w:sz w:val="16"/>
+              </w:rPr>
+              <w:t>dags</w:t>
+            </w:r>
+            <w:proofErr w:type="spellEnd"/>
           </w:p>
         </w:tc>
         <w:tc>
@@ -8948,11 +10179,19 @@
             <w:pPr>
               <w:spacing w:before="40" w:after="40"/>
             </w:pPr>
-            <w:r>
-              <w:rPr>
-                <w:sz w:val="18"/>
-              </w:rPr>
-              <w:t>dbt project, scripts and data</w:t>
+            <w:proofErr w:type="spellStart"/>
+            <w:r>
+              <w:rPr>
+                <w:sz w:val="18"/>
+              </w:rPr>
+              <w:t>dbt</w:t>
+            </w:r>
+            <w:proofErr w:type="spellEnd"/>
+            <w:r>
+              <w:rPr>
+                <w:sz w:val="18"/>
+              </w:rPr>
+              <w:t xml:space="preserve"> project, scripts and data</w:t>
             </w:r>
           </w:p>
         </w:tc>
@@ -8965,7 +10204,15 @@
     </w:p>
     <w:p>
       <w:r>
-        <w:t xml:space="preserve">Because the repo root is mounted, changes to dbt models, scripts or the DAG take effect on the next run </w:t>
+        <w:t xml:space="preserve">Because the repo root is mounted, changes to </w:t>
+      </w:r>
+      <w:proofErr w:type="spellStart"/>
+      <w:r>
+        <w:t>dbt</w:t>
+      </w:r>
+      <w:proofErr w:type="spellEnd"/>
+      <w:r>
+        <w:t xml:space="preserve"> models, scripts or the DAG take effect on the next run </w:t>
       </w:r>
       <w:r>
         <w:rPr>
@@ -8976,6 +10223,7 @@
       <w:r>
         <w:t xml:space="preserve">. Only changes to the </w:t>
       </w:r>
+      <w:proofErr w:type="spellStart"/>
       <w:r>
         <w:rPr>
           <w:rFonts w:ascii="Consolas" w:hAnsi="Consolas"/>
@@ -8984,6 +10232,7 @@
         </w:rPr>
         <w:t>Dockerfile</w:t>
       </w:r>
+      <w:proofErr w:type="spellEnd"/>
       <w:r>
         <w:t xml:space="preserve"> or </w:t>
       </w:r>
@@ -9017,17 +10266,39 @@
       <w:bookmarkStart w:id="19" w:name="_Toc241795026"/>
       <w:r>
         <w:lastRenderedPageBreak/>
-        <w:t>Why a separate dbt virtualenv?</w:t>
+        <w:t xml:space="preserve">Why a separate </w:t>
+      </w:r>
+      <w:proofErr w:type="spellStart"/>
+      <w:r>
+        <w:t>dbt</w:t>
+      </w:r>
+      <w:proofErr w:type="spellEnd"/>
+      <w:r>
+        <w:t xml:space="preserve"> </w:t>
+      </w:r>
+      <w:proofErr w:type="spellStart"/>
+      <w:r>
+        <w:t>virtualenv</w:t>
+      </w:r>
+      <w:proofErr w:type="spellEnd"/>
+      <w:r>
+        <w:t>?</w:t>
       </w:r>
       <w:bookmarkEnd w:id="19"/>
     </w:p>
     <w:p>
       <w:r>
-        <w:t>A</w:t>
-      </w:r>
-      <w:r>
-        <w:t xml:space="preserve">irflow pins a large dependency tree. Installing dbt into the same environment risks version conflicts (e.g. </w:t>
-      </w:r>
+        <w:t xml:space="preserve">Airflow pins a large dependency tree. Installing </w:t>
+      </w:r>
+      <w:proofErr w:type="spellStart"/>
+      <w:r>
+        <w:t>dbt</w:t>
+      </w:r>
+      <w:proofErr w:type="spellEnd"/>
+      <w:r>
+        <w:t xml:space="preserve"> into the same environment risks version conflicts (e.g. </w:t>
+      </w:r>
+      <w:proofErr w:type="spellStart"/>
       <w:r>
         <w:rPr>
           <w:rFonts w:ascii="Consolas" w:hAnsi="Consolas"/>
@@ -9036,6 +10307,7 @@
         </w:rPr>
         <w:t>protobuf</w:t>
       </w:r>
+      <w:proofErr w:type="spellEnd"/>
       <w:r>
         <w:t xml:space="preserve">, </w:t>
       </w:r>
@@ -9048,7 +10320,15 @@
         <w:t>jinja2</w:t>
       </w:r>
       <w:r>
-        <w:t>). A dedicated venv, called by its absolute path (</w:t>
+        <w:t xml:space="preserve">). A dedicated </w:t>
+      </w:r>
+      <w:proofErr w:type="spellStart"/>
+      <w:r>
+        <w:t>venv</w:t>
+      </w:r>
+      <w:proofErr w:type="spellEnd"/>
+      <w:r>
+        <w:t>, called by its absolute path (</w:t>
       </w:r>
       <w:r>
         <w:rPr>
@@ -9056,13 +10336,38 @@
           <w:color w:val="C7254E"/>
           <w:sz w:val="19"/>
         </w:rPr>
-        <w:t>/opt/dbt_venv/bin/dbt</w:t>
-      </w:r>
-      <w:r>
-        <w:t>), keeps the two isolated so each can be upgraded independent</w:t>
-      </w:r>
-      <w:r>
-        <w:t>ly.</w:t>
+        <w:t>/opt/</w:t>
+      </w:r>
+      <w:proofErr w:type="spellStart"/>
+      <w:r>
+        <w:rPr>
+          <w:rFonts w:ascii="Consolas" w:hAnsi="Consolas"/>
+          <w:color w:val="C7254E"/>
+          <w:sz w:val="19"/>
+        </w:rPr>
+        <w:t>dbt_venv</w:t>
+      </w:r>
+      <w:proofErr w:type="spellEnd"/>
+      <w:r>
+        <w:rPr>
+          <w:rFonts w:ascii="Consolas" w:hAnsi="Consolas"/>
+          <w:color w:val="C7254E"/>
+          <w:sz w:val="19"/>
+        </w:rPr>
+        <w:t>/bin/</w:t>
+      </w:r>
+      <w:proofErr w:type="spellStart"/>
+      <w:r>
+        <w:rPr>
+          <w:rFonts w:ascii="Consolas" w:hAnsi="Consolas"/>
+          <w:color w:val="C7254E"/>
+          <w:sz w:val="19"/>
+        </w:rPr>
+        <w:t>dbt</w:t>
+      </w:r>
+      <w:proofErr w:type="spellEnd"/>
+      <w:r>
+        <w:t>), keeps the two isolated so each can be upgraded independently.</w:t>
       </w:r>
     </w:p>
     <w:p>
@@ -9083,10 +10388,20 @@
         <w:pStyle w:val="Heading2"/>
       </w:pPr>
       <w:bookmarkStart w:id="21" w:name="_Toc241795028"/>
-      <w:r>
-        <w:t>my_project/dbt_project.yml</w:t>
+      <w:proofErr w:type="spellStart"/>
+      <w:r>
+        <w:t>my_project</w:t>
+      </w:r>
+      <w:proofErr w:type="spellEnd"/>
+      <w:r>
+        <w:t>/</w:t>
+      </w:r>
+      <w:proofErr w:type="spellStart"/>
+      <w:r>
+        <w:t>dbt_project.yml</w:t>
       </w:r>
       <w:bookmarkEnd w:id="21"/>
+      <w:proofErr w:type="spellEnd"/>
     </w:p>
     <w:p>
       <w:pPr>
@@ -9126,7 +10441,25 @@
           <w:color w:val="24292E"/>
           <w:sz w:val="17"/>
         </w:rPr>
-        <w:t xml:space="preserve">  my_project:</w:t>
+        <w:t xml:space="preserve">  </w:t>
+      </w:r>
+      <w:proofErr w:type="spellStart"/>
+      <w:r>
+        <w:rPr>
+          <w:rFonts w:ascii="Consolas" w:eastAsia="Consolas" w:hAnsi="Consolas"/>
+          <w:color w:val="24292E"/>
+          <w:sz w:val="17"/>
+        </w:rPr>
+        <w:t>my_project</w:t>
+      </w:r>
+      <w:proofErr w:type="spellEnd"/>
+      <w:r>
+        <w:rPr>
+          <w:rFonts w:ascii="Consolas" w:eastAsia="Consolas" w:hAnsi="Consolas"/>
+          <w:color w:val="24292E"/>
+          <w:sz w:val="17"/>
+        </w:rPr>
+        <w:t>:</w:t>
       </w:r>
     </w:p>
     <w:p>
@@ -9226,8 +10559,18 @@
           <w:color w:val="24292E"/>
           <w:sz w:val="17"/>
         </w:rPr>
-        <w:t xml:space="preserve">      +schema: dwh</w:t>
-      </w:r>
+        <w:t xml:space="preserve">      +schema: </w:t>
+      </w:r>
+      <w:proofErr w:type="spellStart"/>
+      <w:r>
+        <w:rPr>
+          <w:rFonts w:ascii="Consolas" w:eastAsia="Consolas" w:hAnsi="Consolas"/>
+          <w:color w:val="24292E"/>
+          <w:sz w:val="17"/>
+        </w:rPr>
+        <w:t>dwh</w:t>
+      </w:r>
+      <w:proofErr w:type="spellEnd"/>
     </w:p>
     <w:p>
       <w:pPr>
@@ -9250,9 +10593,15 @@
       </w:r>
     </w:p>
     <w:p>
-      <w:r>
-        <w:t xml:space="preserve">dbt's default </w:t>
-      </w:r>
+      <w:proofErr w:type="spellStart"/>
+      <w:r>
+        <w:t>dbt's</w:t>
+      </w:r>
+      <w:proofErr w:type="spellEnd"/>
+      <w:r>
+        <w:t xml:space="preserve"> default </w:t>
+      </w:r>
+      <w:proofErr w:type="spellStart"/>
       <w:r>
         <w:rPr>
           <w:rFonts w:ascii="Consolas" w:hAnsi="Consolas"/>
@@ -9261,6 +10610,7 @@
         </w:rPr>
         <w:t>generate_schema_name</w:t>
       </w:r>
+      <w:proofErr w:type="spellEnd"/>
       <w:r>
         <w:t xml:space="preserve"> joins the target schema (</w:t>
       </w:r>
@@ -9275,6 +10625,7 @@
       <w:r>
         <w:t xml:space="preserve">) and the custom schema, which gives </w:t>
       </w:r>
+      <w:proofErr w:type="spellStart"/>
       <w:r>
         <w:rPr>
           <w:rFonts w:ascii="Consolas" w:hAnsi="Consolas"/>
@@ -9283,9 +10634,11 @@
         </w:rPr>
         <w:t>main_stg</w:t>
       </w:r>
+      <w:proofErr w:type="spellEnd"/>
       <w:r>
         <w:t xml:space="preserve"> and </w:t>
       </w:r>
+      <w:proofErr w:type="spellStart"/>
       <w:r>
         <w:rPr>
           <w:rFonts w:ascii="Consolas" w:hAnsi="Consolas"/>
@@ -9294,6 +10647,7 @@
         </w:rPr>
         <w:t>main_dwh</w:t>
       </w:r>
+      <w:proofErr w:type="spellEnd"/>
       <w:r>
         <w:t>.</w:t>
       </w:r>
@@ -9303,10 +10657,20 @@
         <w:pStyle w:val="Heading2"/>
       </w:pPr>
       <w:bookmarkStart w:id="22" w:name="_Toc241795029"/>
-      <w:r>
-        <w:t>my_project/profiles.yml</w:t>
+      <w:proofErr w:type="spellStart"/>
+      <w:r>
+        <w:t>my_project</w:t>
+      </w:r>
+      <w:proofErr w:type="spellEnd"/>
+      <w:r>
+        <w:t>/</w:t>
+      </w:r>
+      <w:proofErr w:type="spellStart"/>
+      <w:r>
+        <w:t>profiles.yml</w:t>
       </w:r>
       <w:bookmarkEnd w:id="22"/>
+      <w:proofErr w:type="spellEnd"/>
     </w:p>
     <w:p>
       <w:pPr>
@@ -9320,13 +10684,23 @@
         <w:spacing w:before="120" w:after="0" w:line="240" w:lineRule="auto"/>
         <w:ind w:left="113"/>
       </w:pPr>
+      <w:proofErr w:type="spellStart"/>
       <w:r>
         <w:rPr>
           <w:rFonts w:ascii="Consolas" w:eastAsia="Consolas" w:hAnsi="Consolas"/>
           <w:color w:val="24292E"/>
           <w:sz w:val="17"/>
         </w:rPr>
-        <w:t>my_project:</w:t>
+        <w:t>my_project</w:t>
+      </w:r>
+      <w:proofErr w:type="spellEnd"/>
+      <w:r>
+        <w:rPr>
+          <w:rFonts w:ascii="Consolas" w:eastAsia="Consolas" w:hAnsi="Consolas"/>
+          <w:color w:val="24292E"/>
+          <w:sz w:val="17"/>
+        </w:rPr>
+        <w:t>:</w:t>
       </w:r>
     </w:p>
     <w:p>
@@ -9406,8 +10780,18 @@
           <w:color w:val="24292E"/>
           <w:sz w:val="17"/>
         </w:rPr>
-        <w:t xml:space="preserve">      type: duckdb</w:t>
-      </w:r>
+        <w:t xml:space="preserve">      type: </w:t>
+      </w:r>
+      <w:proofErr w:type="spellStart"/>
+      <w:r>
+        <w:rPr>
+          <w:rFonts w:ascii="Consolas" w:eastAsia="Consolas" w:hAnsi="Consolas"/>
+          <w:color w:val="24292E"/>
+          <w:sz w:val="17"/>
+        </w:rPr>
+        <w:t>duckdb</w:t>
+      </w:r>
+      <w:proofErr w:type="spellEnd"/>
     </w:p>
     <w:p>
       <w:pPr>
@@ -9426,7 +10810,45 @@
           <w:color w:val="24292E"/>
           <w:sz w:val="17"/>
         </w:rPr>
-        <w:t xml:space="preserve">      path: dev.duckdb   # relative to my_project/</w:t>
+        <w:t xml:space="preserve">      path: </w:t>
+      </w:r>
+      <w:proofErr w:type="spellStart"/>
+      <w:proofErr w:type="gramStart"/>
+      <w:r>
+        <w:rPr>
+          <w:rFonts w:ascii="Consolas" w:eastAsia="Consolas" w:hAnsi="Consolas"/>
+          <w:color w:val="24292E"/>
+          <w:sz w:val="17"/>
+        </w:rPr>
+        <w:t>dev.duckdb</w:t>
+      </w:r>
+      <w:proofErr w:type="spellEnd"/>
+      <w:proofErr w:type="gramEnd"/>
+      <w:r>
+        <w:rPr>
+          <w:rFonts w:ascii="Consolas" w:eastAsia="Consolas" w:hAnsi="Consolas"/>
+          <w:color w:val="24292E"/>
+          <w:sz w:val="17"/>
+        </w:rPr>
+        <w:t xml:space="preserve">   # relative to </w:t>
+      </w:r>
+      <w:proofErr w:type="spellStart"/>
+      <w:r>
+        <w:rPr>
+          <w:rFonts w:ascii="Consolas" w:eastAsia="Consolas" w:hAnsi="Consolas"/>
+          <w:color w:val="24292E"/>
+          <w:sz w:val="17"/>
+        </w:rPr>
+        <w:t>my_project</w:t>
+      </w:r>
+      <w:proofErr w:type="spellEnd"/>
+      <w:r>
+        <w:rPr>
+          <w:rFonts w:ascii="Consolas" w:eastAsia="Consolas" w:hAnsi="Consolas"/>
+          <w:color w:val="24292E"/>
+          <w:sz w:val="17"/>
+        </w:rPr>
+        <w:t>/</w:t>
       </w:r>
     </w:p>
     <w:p>
@@ -9459,7 +10881,15 @@
         <w:t>threads: 1</w:t>
       </w:r>
       <w:r>
-        <w:t xml:space="preserve"> is deliberate, because DuckDB allows a single writer.</w:t>
+        <w:t xml:space="preserve"> is deliberate, because </w:t>
+      </w:r>
+      <w:proofErr w:type="spellStart"/>
+      <w:r>
+        <w:t>DuckDB</w:t>
+      </w:r>
+      <w:proofErr w:type="spellEnd"/>
+      <w:r>
+        <w:t xml:space="preserve"> allows a single writer.</w:t>
       </w:r>
     </w:p>
     <w:p>
@@ -9468,7 +10898,15 @@
       </w:pPr>
       <w:bookmarkStart w:id="23" w:name="_Toc241795030"/>
       <w:r>
-        <w:t>Airflow environment (docker-compose.yml)</w:t>
+        <w:t>Airflow environment (docker-</w:t>
+      </w:r>
+      <w:proofErr w:type="spellStart"/>
+      <w:r>
+        <w:t>compose.yml</w:t>
+      </w:r>
+      <w:proofErr w:type="spellEnd"/>
+      <w:r>
+        <w:t>)</w:t>
       </w:r>
       <w:bookmarkEnd w:id="23"/>
     </w:p>
@@ -9801,7 +11239,21 @@
               <w:rPr>
                 <w:sz w:val="18"/>
               </w:rPr>
-              <w:t>Turns off dbt anonymous usage stats</w:t>
+              <w:t xml:space="preserve">Turns off </w:t>
+            </w:r>
+            <w:proofErr w:type="spellStart"/>
+            <w:r>
+              <w:rPr>
+                <w:sz w:val="18"/>
+              </w:rPr>
+              <w:t>dbt</w:t>
+            </w:r>
+            <w:proofErr w:type="spellEnd"/>
+            <w:r>
+              <w:rPr>
+                <w:sz w:val="18"/>
+              </w:rPr>
+              <w:t xml:space="preserve"> anonymous usage stats</w:t>
             </w:r>
           </w:p>
         </w:tc>
@@ -9973,15 +11425,7 @@
                 <w:color w:val="C7254E"/>
                 <w:sz w:val="16"/>
               </w:rPr>
-              <w:t xml:space="preserve">cd airflow </w:t>
-            </w:r>
-            <w:r>
-              <w:rPr>
-                <w:rFonts w:ascii="Consolas" w:hAnsi="Consolas"/>
-                <w:color w:val="C7254E"/>
-                <w:sz w:val="16"/>
-              </w:rPr>
-              <w:t>&amp;&amp; docker compose down</w:t>
+              <w:t>cd airflow &amp;&amp; docker compose down</w:t>
             </w:r>
           </w:p>
         </w:tc>
@@ -10023,6 +11467,7 @@
               </w:rPr>
               <w:t xml:space="preserve">Airflow UI → </w:t>
             </w:r>
+            <w:proofErr w:type="spellStart"/>
             <w:r>
               <w:rPr>
                 <w:rFonts w:ascii="Consolas" w:hAnsi="Consolas"/>
@@ -10031,6 +11476,7 @@
               </w:rPr>
               <w:t>superstore_dwh</w:t>
             </w:r>
+            <w:proofErr w:type="spellEnd"/>
             <w:r>
               <w:rPr>
                 <w:sz w:val="18"/>
@@ -10139,14 +11585,34 @@
               </w:rPr>
               <w:t xml:space="preserve">Delete </w:t>
             </w:r>
+            <w:proofErr w:type="spellStart"/>
             <w:r>
               <w:rPr>
                 <w:rFonts w:ascii="Consolas" w:hAnsi="Consolas"/>
                 <w:color w:val="C7254E"/>
                 <w:sz w:val="16"/>
               </w:rPr>
-              <w:t>my_project/dev.duckdb</w:t>
-            </w:r>
+              <w:t>my_project</w:t>
+            </w:r>
+            <w:proofErr w:type="spellEnd"/>
+            <w:r>
+              <w:rPr>
+                <w:rFonts w:ascii="Consolas" w:hAnsi="Consolas"/>
+                <w:color w:val="C7254E"/>
+                <w:sz w:val="16"/>
+              </w:rPr>
+              <w:t>/</w:t>
+            </w:r>
+            <w:proofErr w:type="spellStart"/>
+            <w:r>
+              <w:rPr>
+                <w:rFonts w:ascii="Consolas" w:hAnsi="Consolas"/>
+                <w:color w:val="C7254E"/>
+                <w:sz w:val="16"/>
+              </w:rPr>
+              <w:t>dev.duckdb</w:t>
+            </w:r>
+            <w:proofErr w:type="spellEnd"/>
             <w:r>
               <w:rPr>
                 <w:sz w:val="18"/>
@@ -10175,13 +11641,21 @@
               <w:rPr>
                 <w:sz w:val="18"/>
               </w:rPr>
-              <w:t>Run dbt in</w:t>
-            </w:r>
-            <w:r>
-              <w:rPr>
-                <w:sz w:val="18"/>
-              </w:rPr>
-              <w:t xml:space="preserve"> the container</w:t>
+              <w:t xml:space="preserve">Run </w:t>
+            </w:r>
+            <w:proofErr w:type="spellStart"/>
+            <w:r>
+              <w:rPr>
+                <w:sz w:val="18"/>
+              </w:rPr>
+              <w:t>dbt</w:t>
+            </w:r>
+            <w:proofErr w:type="spellEnd"/>
+            <w:r>
+              <w:rPr>
+                <w:sz w:val="18"/>
+              </w:rPr>
+              <w:t xml:space="preserve"> in the container</w:t>
             </w:r>
           </w:p>
         </w:tc>
@@ -10201,7 +11675,89 @@
                 <w:color w:val="C7254E"/>
                 <w:sz w:val="16"/>
               </w:rPr>
-              <w:t>docker exec -it superstore-airflow bash -c "cd /opt/airflow/project/my_project &amp;&amp; /opt/dbt_venv/bin/dbt build --profiles-dir . --target dev"</w:t>
+              <w:t>docker exec -it superstore-airflow bash -c "cd /opt/airflow/project/</w:t>
+            </w:r>
+            <w:proofErr w:type="spellStart"/>
+            <w:r>
+              <w:rPr>
+                <w:rFonts w:ascii="Consolas" w:hAnsi="Consolas"/>
+                <w:color w:val="C7254E"/>
+                <w:sz w:val="16"/>
+              </w:rPr>
+              <w:t>my_project</w:t>
+            </w:r>
+            <w:proofErr w:type="spellEnd"/>
+            <w:r>
+              <w:rPr>
+                <w:rFonts w:ascii="Consolas" w:hAnsi="Consolas"/>
+                <w:color w:val="C7254E"/>
+                <w:sz w:val="16"/>
+              </w:rPr>
+              <w:t xml:space="preserve"> &amp;&amp; /opt/</w:t>
+            </w:r>
+            <w:proofErr w:type="spellStart"/>
+            <w:r>
+              <w:rPr>
+                <w:rFonts w:ascii="Consolas" w:hAnsi="Consolas"/>
+                <w:color w:val="C7254E"/>
+                <w:sz w:val="16"/>
+              </w:rPr>
+              <w:t>dbt_venv</w:t>
+            </w:r>
+            <w:proofErr w:type="spellEnd"/>
+            <w:r>
+              <w:rPr>
+                <w:rFonts w:ascii="Consolas" w:hAnsi="Consolas"/>
+                <w:color w:val="C7254E"/>
+                <w:sz w:val="16"/>
+              </w:rPr>
+              <w:t>/bin/</w:t>
+            </w:r>
+            <w:proofErr w:type="spellStart"/>
+            <w:r>
+              <w:rPr>
+                <w:rFonts w:ascii="Consolas" w:hAnsi="Consolas"/>
+                <w:color w:val="C7254E"/>
+                <w:sz w:val="16"/>
+              </w:rPr>
+              <w:t>dbt</w:t>
+            </w:r>
+            <w:proofErr w:type="spellEnd"/>
+            <w:r>
+              <w:rPr>
+                <w:rFonts w:ascii="Consolas" w:hAnsi="Consolas"/>
+                <w:color w:val="C7254E"/>
+                <w:sz w:val="16"/>
+              </w:rPr>
+              <w:t xml:space="preserve"> build --profiles-</w:t>
+            </w:r>
+            <w:proofErr w:type="spellStart"/>
+            <w:proofErr w:type="gramStart"/>
+            <w:r>
+              <w:rPr>
+                <w:rFonts w:ascii="Consolas" w:hAnsi="Consolas"/>
+                <w:color w:val="C7254E"/>
+                <w:sz w:val="16"/>
+              </w:rPr>
+              <w:t>dir</w:t>
+            </w:r>
+            <w:proofErr w:type="spellEnd"/>
+            <w:r>
+              <w:rPr>
+                <w:rFonts w:ascii="Consolas" w:hAnsi="Consolas"/>
+                <w:color w:val="C7254E"/>
+                <w:sz w:val="16"/>
+              </w:rPr>
+              <w:t xml:space="preserve"> .</w:t>
+            </w:r>
+            <w:proofErr w:type="gramEnd"/>
+            <w:r>
+              <w:rPr>
+                <w:rFonts w:ascii="Consolas" w:hAnsi="Consolas"/>
+                <w:color w:val="C7254E"/>
+                <w:sz w:val="16"/>
+              </w:rPr>
+              <w:t xml:space="preserve"> --target dev"</w:t>
             </w:r>
           </w:p>
         </w:tc>
@@ -10243,7 +11799,43 @@
                 <w:color w:val="C7254E"/>
                 <w:sz w:val="16"/>
               </w:rPr>
-              <w:t>airflow/logs/dag_id=superstore_dwh/…</w:t>
+              <w:t>airflow/logs/</w:t>
+            </w:r>
+            <w:proofErr w:type="spellStart"/>
+            <w:r>
+              <w:rPr>
+                <w:rFonts w:ascii="Consolas" w:hAnsi="Consolas"/>
+                <w:color w:val="C7254E"/>
+                <w:sz w:val="16"/>
+              </w:rPr>
+              <w:t>dag_id</w:t>
+            </w:r>
+            <w:proofErr w:type="spellEnd"/>
+            <w:r>
+              <w:rPr>
+                <w:rFonts w:ascii="Consolas" w:hAnsi="Consolas"/>
+                <w:color w:val="C7254E"/>
+                <w:sz w:val="16"/>
+              </w:rPr>
+              <w:t>=</w:t>
+            </w:r>
+            <w:proofErr w:type="spellStart"/>
+            <w:r>
+              <w:rPr>
+                <w:rFonts w:ascii="Consolas" w:hAnsi="Consolas"/>
+                <w:color w:val="C7254E"/>
+                <w:sz w:val="16"/>
+              </w:rPr>
+              <w:t>superstore_dwh</w:t>
+            </w:r>
+            <w:proofErr w:type="spellEnd"/>
+            <w:r>
+              <w:rPr>
+                <w:rFonts w:ascii="Consolas" w:hAnsi="Consolas"/>
+                <w:color w:val="C7254E"/>
+                <w:sz w:val="16"/>
+              </w:rPr>
+              <w:t>/…</w:t>
             </w:r>
           </w:p>
         </w:tc>
@@ -10453,7 +12045,21 @@
               <w:rPr>
                 <w:sz w:val="18"/>
               </w:rPr>
-              <w:t xml:space="preserve"> in the DAG doesn't match the dbt folder name</w:t>
+              <w:t xml:space="preserve"> in the DAG doesn't match the </w:t>
+            </w:r>
+            <w:proofErr w:type="spellStart"/>
+            <w:r>
+              <w:rPr>
+                <w:sz w:val="18"/>
+              </w:rPr>
+              <w:t>dbt</w:t>
+            </w:r>
+            <w:proofErr w:type="spellEnd"/>
+            <w:r>
+              <w:rPr>
+                <w:sz w:val="18"/>
+              </w:rPr>
+              <w:t xml:space="preserve"> folder name</w:t>
             </w:r>
           </w:p>
         </w:tc>
@@ -10492,8 +12098,18 @@
                 <w:color w:val="C7254E"/>
                 <w:sz w:val="16"/>
               </w:rPr>
-              <w:t>{PROJECT_DIR}/my_project</w:t>
-            </w:r>
+              <w:t>{PROJECT_DIR}/</w:t>
+            </w:r>
+            <w:proofErr w:type="spellStart"/>
+            <w:r>
+              <w:rPr>
+                <w:rFonts w:ascii="Consolas" w:hAnsi="Consolas"/>
+                <w:color w:val="C7254E"/>
+                <w:sz w:val="16"/>
+              </w:rPr>
+              <w:t>my_project</w:t>
+            </w:r>
+            <w:proofErr w:type="spellEnd"/>
           </w:p>
         </w:tc>
       </w:tr>
@@ -10518,53 +12134,25 @@
                 <w:color w:val="C7254E"/>
                 <w:sz w:val="16"/>
               </w:rPr>
-              <w:t>Could not find profile named 'my_project'</w:t>
-            </w:r>
-          </w:p>
-        </w:tc>
-        <w:tc>
-          <w:tcPr>
-            <w:tcW w:w="3213" w:type="dxa"/>
-            <w:shd w:val="clear" w:color="auto" w:fill="EEF3F9"/>
-          </w:tcPr>
-          <w:p>
-            <w:pPr>
-              <w:keepNext/>
-              <w:spacing w:before="40" w:after="40"/>
-            </w:pPr>
-            <w:r>
-              <w:rPr>
-                <w:sz w:val="18"/>
-              </w:rPr>
-              <w:t xml:space="preserve">Profile name in </w:t>
-            </w:r>
+              <w:t>Could not find profile named '</w:t>
+            </w:r>
+            <w:proofErr w:type="spellStart"/>
             <w:r>
               <w:rPr>
                 <w:rFonts w:ascii="Consolas" w:hAnsi="Consolas"/>
                 <w:color w:val="C7254E"/>
                 <w:sz w:val="16"/>
               </w:rPr>
-              <w:t>profiles.yml</w:t>
-            </w:r>
-            <w:r>
-              <w:rPr>
-                <w:sz w:val="18"/>
-              </w:rPr>
-              <w:t xml:space="preserve"> doesn't match </w:t>
-            </w:r>
+              <w:t>my_project</w:t>
+            </w:r>
+            <w:proofErr w:type="spellEnd"/>
             <w:r>
               <w:rPr>
                 <w:rFonts w:ascii="Consolas" w:hAnsi="Consolas"/>
                 <w:color w:val="C7254E"/>
                 <w:sz w:val="16"/>
               </w:rPr>
-              <w:t>dbt_project.yml</w:t>
-            </w:r>
-            <w:r>
-              <w:rPr>
-                <w:sz w:val="18"/>
-              </w:rPr>
-              <w:t xml:space="preserve"> (case-sensitive)</w:t>
+              <w:t>'</w:t>
             </w:r>
           </w:p>
         </w:tc>
@@ -10582,16 +12170,68 @@
               <w:rPr>
                 <w:sz w:val="18"/>
               </w:rPr>
-              <w:t xml:space="preserve">Make both exactly </w:t>
-            </w:r>
+              <w:t xml:space="preserve">Profile name in </w:t>
+            </w:r>
+            <w:proofErr w:type="spellStart"/>
             <w:r>
               <w:rPr>
                 <w:rFonts w:ascii="Consolas" w:hAnsi="Consolas"/>
                 <w:color w:val="C7254E"/>
                 <w:sz w:val="16"/>
               </w:rPr>
+              <w:t>profiles.yml</w:t>
+            </w:r>
+            <w:proofErr w:type="spellEnd"/>
+            <w:r>
+              <w:rPr>
+                <w:sz w:val="18"/>
+              </w:rPr>
+              <w:t xml:space="preserve"> doesn't match </w:t>
+            </w:r>
+            <w:proofErr w:type="spellStart"/>
+            <w:r>
+              <w:rPr>
+                <w:rFonts w:ascii="Consolas" w:hAnsi="Consolas"/>
+                <w:color w:val="C7254E"/>
+                <w:sz w:val="16"/>
+              </w:rPr>
+              <w:t>dbt_project.yml</w:t>
+            </w:r>
+            <w:proofErr w:type="spellEnd"/>
+            <w:r>
+              <w:rPr>
+                <w:sz w:val="18"/>
+              </w:rPr>
+              <w:t xml:space="preserve"> (case-sensitive)</w:t>
+            </w:r>
+          </w:p>
+        </w:tc>
+        <w:tc>
+          <w:tcPr>
+            <w:tcW w:w="3213" w:type="dxa"/>
+            <w:shd w:val="clear" w:color="auto" w:fill="EEF3F9"/>
+          </w:tcPr>
+          <w:p>
+            <w:pPr>
+              <w:keepNext/>
+              <w:spacing w:before="40" w:after="40"/>
+            </w:pPr>
+            <w:r>
+              <w:rPr>
+                <w:sz w:val="18"/>
+              </w:rPr>
+              <w:t xml:space="preserve">Make both exactly </w:t>
+            </w:r>
+            <w:proofErr w:type="spellStart"/>
+            <w:r>
+              <w:rPr>
+                <w:rFonts w:ascii="Consolas" w:hAnsi="Consolas"/>
+                <w:color w:val="C7254E"/>
+                <w:sz w:val="16"/>
+              </w:rPr>
               <w:t>my_project</w:t>
             </w:r>
+            <w:proofErr w:type="spellEnd"/>
           </w:p>
         </w:tc>
       </w:tr>
@@ -10632,14 +12272,30 @@
               <w:rPr>
                 <w:sz w:val="18"/>
               </w:rPr>
-              <w:t xml:space="preserve">YAML indentation error. dbt strips </w:t>
-            </w:r>
-            <w:r>
-              <w:rPr>
-                <w:sz w:val="18"/>
-              </w:rPr>
-              <w:t>leading whitespace from the file, so a fully indented file breaks</w:t>
-            </w:r>
+              <w:t xml:space="preserve">YAML indentation error. </w:t>
+            </w:r>
+            <w:proofErr w:type="spellStart"/>
+            <w:r>
+              <w:rPr>
+                <w:sz w:val="18"/>
+              </w:rPr>
+              <w:t>dbt</w:t>
+            </w:r>
+            <w:proofErr w:type="spellEnd"/>
+            <w:r>
+              <w:rPr>
+                <w:sz w:val="18"/>
+              </w:rPr>
+              <w:t xml:space="preserve"> strips leading whitespace from the file, so a fully indented file </w:t>
+            </w:r>
+            <w:proofErr w:type="gramStart"/>
+            <w:r>
+              <w:rPr>
+                <w:sz w:val="18"/>
+              </w:rPr>
+              <w:t>breaks</w:t>
+            </w:r>
+            <w:proofErr w:type="gramEnd"/>
           </w:p>
         </w:tc>
         <w:tc>
@@ -10775,7 +12431,25 @@
                 <w:color w:val="C7254E"/>
                 <w:sz w:val="16"/>
               </w:rPr>
-              <w:t>models: my_project:</w:t>
+              <w:t xml:space="preserve">models: </w:t>
+            </w:r>
+            <w:proofErr w:type="spellStart"/>
+            <w:r>
+              <w:rPr>
+                <w:rFonts w:ascii="Consolas" w:hAnsi="Consolas"/>
+                <w:color w:val="C7254E"/>
+                <w:sz w:val="16"/>
+              </w:rPr>
+              <w:t>my_project</w:t>
+            </w:r>
+            <w:proofErr w:type="spellEnd"/>
+            <w:r>
+              <w:rPr>
+                <w:rFonts w:ascii="Consolas" w:hAnsi="Consolas"/>
+                <w:color w:val="C7254E"/>
+                <w:sz w:val="16"/>
+              </w:rPr>
+              <w:t>:</w:t>
             </w:r>
           </w:p>
         </w:tc>
@@ -10800,15 +12474,27 @@
                 <w:color w:val="C7254E"/>
                 <w:sz w:val="16"/>
               </w:rPr>
-              <w:t>IO</w:t>
-            </w:r>
+              <w:t>IO Error: Could not set lock on file "</w:t>
+            </w:r>
+            <w:proofErr w:type="spellStart"/>
+            <w:proofErr w:type="gramStart"/>
             <w:r>
               <w:rPr>
                 <w:rFonts w:ascii="Consolas" w:hAnsi="Consolas"/>
                 <w:color w:val="C7254E"/>
                 <w:sz w:val="16"/>
               </w:rPr>
-              <w:t xml:space="preserve"> Error: Could not set lock on file "dev.duckdb"</w:t>
+              <w:t>dev.duckdb</w:t>
+            </w:r>
+            <w:proofErr w:type="spellEnd"/>
+            <w:proofErr w:type="gramEnd"/>
+            <w:r>
+              <w:rPr>
+                <w:rFonts w:ascii="Consolas" w:hAnsi="Consolas"/>
+                <w:color w:val="C7254E"/>
+                <w:sz w:val="16"/>
+              </w:rPr>
+              <w:t>"</w:t>
             </w:r>
           </w:p>
         </w:tc>
@@ -10825,7 +12511,21 @@
               <w:rPr>
                 <w:sz w:val="18"/>
               </w:rPr>
-              <w:t>Another process (DBeaver, CLI, notebook) has the DB open</w:t>
+              <w:t>Another process (</w:t>
+            </w:r>
+            <w:proofErr w:type="spellStart"/>
+            <w:r>
+              <w:rPr>
+                <w:sz w:val="18"/>
+              </w:rPr>
+              <w:t>DBeaver</w:t>
+            </w:r>
+            <w:proofErr w:type="spellEnd"/>
+            <w:r>
+              <w:rPr>
+                <w:sz w:val="18"/>
+              </w:rPr>
+              <w:t>, CLI, notebook) has the DB open</w:t>
             </w:r>
           </w:p>
         </w:tc>
@@ -10876,6 +12576,7 @@
               </w:rPr>
               <w:t xml:space="preserve"> in </w:t>
             </w:r>
+            <w:proofErr w:type="spellStart"/>
             <w:r>
               <w:rPr>
                 <w:rFonts w:ascii="Consolas" w:hAnsi="Consolas"/>
@@ -10884,6 +12585,7 @@
               </w:rPr>
               <w:t>dbt_test_sources</w:t>
             </w:r>
+            <w:proofErr w:type="spellEnd"/>
           </w:p>
         </w:tc>
         <w:tc>
@@ -10918,13 +12620,7 @@
               <w:rPr>
                 <w:sz w:val="18"/>
               </w:rPr>
-              <w:t xml:space="preserve">Expected until source tests are added </w:t>
-            </w:r>
-            <w:r>
-              <w:rPr>
-                <w:sz w:val="18"/>
-              </w:rPr>
-              <w:t>(see Limitations)</w:t>
+              <w:t>Expected until source tests are added (see Limitations)</w:t>
             </w:r>
           </w:p>
         </w:tc>
@@ -10949,38 +12645,126 @@
                 <w:color w:val="C7254E"/>
                 <w:sz w:val="16"/>
               </w:rPr>
-              <w:t>'dbt_duckdb://macros/columns.sql'</w:t>
-            </w:r>
-            <w:r>
-              <w:rPr>
-                <w:sz w:val="18"/>
-              </w:rPr>
-              <w:t xml:space="preserve"> KeyError during parsing</w:t>
-            </w:r>
-          </w:p>
-        </w:tc>
-        <w:tc>
-          <w:tcPr>
-            <w:tcW w:w="3213" w:type="dxa"/>
-          </w:tcPr>
-          <w:p>
-            <w:pPr>
-              <w:keepNext/>
-              <w:spacing w:before="40" w:after="40"/>
-            </w:pPr>
+              <w:t>'</w:t>
+            </w:r>
+            <w:proofErr w:type="spellStart"/>
             <w:r>
               <w:rPr>
                 <w:rFonts w:ascii="Consolas" w:hAnsi="Consolas"/>
                 <w:color w:val="C7254E"/>
                 <w:sz w:val="16"/>
               </w:rPr>
-              <w:t>target/partial_parse.msgpack</w:t>
-            </w:r>
-            <w:r>
-              <w:rPr>
-                <w:sz w:val="18"/>
-              </w:rPr>
-              <w:t xml:space="preserve"> was written by dbt on Windows (backslash paths) and reused by dbt in the container</w:t>
+              <w:t>dbt_duckdb</w:t>
+            </w:r>
+            <w:proofErr w:type="spellEnd"/>
+            <w:r>
+              <w:rPr>
+                <w:rFonts w:ascii="Consolas" w:hAnsi="Consolas"/>
+                <w:color w:val="C7254E"/>
+                <w:sz w:val="16"/>
+              </w:rPr>
+              <w:t>://macros/</w:t>
+            </w:r>
+            <w:proofErr w:type="spellStart"/>
+            <w:r>
+              <w:rPr>
+                <w:rFonts w:ascii="Consolas" w:hAnsi="Consolas"/>
+                <w:color w:val="C7254E"/>
+                <w:sz w:val="16"/>
+              </w:rPr>
+              <w:t>columns.sql</w:t>
+            </w:r>
+            <w:proofErr w:type="spellEnd"/>
+            <w:r>
+              <w:rPr>
+                <w:rFonts w:ascii="Consolas" w:hAnsi="Consolas"/>
+                <w:color w:val="C7254E"/>
+                <w:sz w:val="16"/>
+              </w:rPr>
+              <w:t>'</w:t>
+            </w:r>
+            <w:r>
+              <w:rPr>
+                <w:sz w:val="18"/>
+              </w:rPr>
+              <w:t xml:space="preserve"> </w:t>
+            </w:r>
+            <w:proofErr w:type="spellStart"/>
+            <w:r>
+              <w:rPr>
+                <w:sz w:val="18"/>
+              </w:rPr>
+              <w:t>KeyError</w:t>
+            </w:r>
+            <w:proofErr w:type="spellEnd"/>
+            <w:r>
+              <w:rPr>
+                <w:sz w:val="18"/>
+              </w:rPr>
+              <w:t xml:space="preserve"> during parsing</w:t>
+            </w:r>
+          </w:p>
+        </w:tc>
+        <w:tc>
+          <w:tcPr>
+            <w:tcW w:w="3213" w:type="dxa"/>
+          </w:tcPr>
+          <w:p>
+            <w:pPr>
+              <w:keepNext/>
+              <w:spacing w:before="40" w:after="40"/>
+            </w:pPr>
+            <w:r>
+              <w:rPr>
+                <w:rFonts w:ascii="Consolas" w:hAnsi="Consolas"/>
+                <w:color w:val="C7254E"/>
+                <w:sz w:val="16"/>
+              </w:rPr>
+              <w:t>target/</w:t>
+            </w:r>
+            <w:proofErr w:type="spellStart"/>
+            <w:r>
+              <w:rPr>
+                <w:rFonts w:ascii="Consolas" w:hAnsi="Consolas"/>
+                <w:color w:val="C7254E"/>
+                <w:sz w:val="16"/>
+              </w:rPr>
+              <w:t>partial_parse.msgpack</w:t>
+            </w:r>
+            <w:proofErr w:type="spellEnd"/>
+            <w:r>
+              <w:rPr>
+                <w:sz w:val="18"/>
+              </w:rPr>
+              <w:t xml:space="preserve"> was written by </w:t>
+            </w:r>
+            <w:proofErr w:type="spellStart"/>
+            <w:r>
+              <w:rPr>
+                <w:sz w:val="18"/>
+              </w:rPr>
+              <w:t>dbt</w:t>
+            </w:r>
+            <w:proofErr w:type="spellEnd"/>
+            <w:r>
+              <w:rPr>
+                <w:sz w:val="18"/>
+              </w:rPr>
+              <w:t xml:space="preserve"> on Windows (backslash paths) and reused by </w:t>
+            </w:r>
+            <w:proofErr w:type="spellStart"/>
+            <w:r>
+              <w:rPr>
+                <w:sz w:val="18"/>
+              </w:rPr>
+              <w:t>dbt</w:t>
+            </w:r>
+            <w:proofErr w:type="spellEnd"/>
+            <w:r>
+              <w:rPr>
+                <w:sz w:val="18"/>
+              </w:rPr>
+              <w:t xml:space="preserve"> in the container</w:t>
             </w:r>
           </w:p>
         </w:tc>
@@ -11031,57 +12815,77 @@
               <w:keepNext/>
               <w:spacing w:before="40" w:after="40"/>
             </w:pPr>
+            <w:proofErr w:type="spellStart"/>
             <w:r>
               <w:rPr>
                 <w:rFonts w:ascii="Consolas" w:hAnsi="Consolas"/>
                 <w:color w:val="C7254E"/>
                 <w:sz w:val="16"/>
               </w:rPr>
-              <w:t>dbt docs serve</w:t>
-            </w:r>
-            <w:r>
-              <w:rPr>
-                <w:sz w:val="18"/>
-              </w:rPr>
-              <w:t xml:space="preserve"> fails, or opens Airflow instead</w:t>
-            </w:r>
-          </w:p>
-        </w:tc>
-        <w:tc>
-          <w:tcPr>
-            <w:tcW w:w="3213" w:type="dxa"/>
-            <w:shd w:val="clear" w:color="auto" w:fill="EEF3F9"/>
-          </w:tcPr>
-          <w:p>
-            <w:pPr>
-              <w:keepNext/>
-              <w:spacing w:before="40" w:after="40"/>
-            </w:pPr>
-            <w:r>
-              <w:rPr>
-                <w:sz w:val="18"/>
-              </w:rPr>
-              <w:t>Both default to port 8080</w:t>
-            </w:r>
-          </w:p>
-        </w:tc>
-        <w:tc>
-          <w:tcPr>
-            <w:tcW w:w="3213" w:type="dxa"/>
-            <w:shd w:val="clear" w:color="auto" w:fill="EEF3F9"/>
-          </w:tcPr>
-          <w:p>
-            <w:pPr>
-              <w:keepNext/>
-              <w:spacing w:before="40" w:after="40"/>
-            </w:pPr>
+              <w:t>dbt</w:t>
+            </w:r>
+            <w:proofErr w:type="spellEnd"/>
             <w:r>
               <w:rPr>
                 <w:rFonts w:ascii="Consolas" w:hAnsi="Consolas"/>
                 <w:color w:val="C7254E"/>
                 <w:sz w:val="16"/>
               </w:rPr>
-              <w:t>dbt docs serve --port 8081</w:t>
+              <w:t xml:space="preserve"> docs serve</w:t>
+            </w:r>
+            <w:r>
+              <w:rPr>
+                <w:sz w:val="18"/>
+              </w:rPr>
+              <w:t xml:space="preserve"> fails, or opens Airflow instead</w:t>
+            </w:r>
+          </w:p>
+        </w:tc>
+        <w:tc>
+          <w:tcPr>
+            <w:tcW w:w="3213" w:type="dxa"/>
+            <w:shd w:val="clear" w:color="auto" w:fill="EEF3F9"/>
+          </w:tcPr>
+          <w:p>
+            <w:pPr>
+              <w:keepNext/>
+              <w:spacing w:before="40" w:after="40"/>
+            </w:pPr>
+            <w:r>
+              <w:rPr>
+                <w:sz w:val="18"/>
+              </w:rPr>
+              <w:t>Both default to port 8080</w:t>
+            </w:r>
+          </w:p>
+        </w:tc>
+        <w:tc>
+          <w:tcPr>
+            <w:tcW w:w="3213" w:type="dxa"/>
+            <w:shd w:val="clear" w:color="auto" w:fill="EEF3F9"/>
+          </w:tcPr>
+          <w:p>
+            <w:pPr>
+              <w:keepNext/>
+              <w:spacing w:before="40" w:after="40"/>
+            </w:pPr>
+            <w:proofErr w:type="spellStart"/>
+            <w:r>
+              <w:rPr>
+                <w:rFonts w:ascii="Consolas" w:hAnsi="Consolas"/>
+                <w:color w:val="C7254E"/>
+                <w:sz w:val="16"/>
+              </w:rPr>
+              <w:t>dbt</w:t>
+            </w:r>
+            <w:proofErr w:type="spellEnd"/>
+            <w:r>
+              <w:rPr>
+                <w:rFonts w:ascii="Consolas" w:hAnsi="Consolas"/>
+                <w:color w:val="C7254E"/>
+                <w:sz w:val="16"/>
+              </w:rPr>
+              <w:t xml:space="preserve"> docs serve --port 8081</w:t>
             </w:r>
           </w:p>
         </w:tc>
@@ -11143,7 +12947,25 @@
                 <w:color w:val="C7254E"/>
                 <w:sz w:val="16"/>
               </w:rPr>
-              <w:t>airflow/logs/dag_processor/…</w:t>
+              <w:t>airflow/logs/</w:t>
+            </w:r>
+            <w:proofErr w:type="spellStart"/>
+            <w:r>
+              <w:rPr>
+                <w:rFonts w:ascii="Consolas" w:hAnsi="Consolas"/>
+                <w:color w:val="C7254E"/>
+                <w:sz w:val="16"/>
+              </w:rPr>
+              <w:t>dag_processor</w:t>
+            </w:r>
+            <w:proofErr w:type="spellEnd"/>
+            <w:r>
+              <w:rPr>
+                <w:rFonts w:ascii="Consolas" w:hAnsi="Consolas"/>
+                <w:color w:val="C7254E"/>
+                <w:sz w:val="16"/>
+              </w:rPr>
+              <w:t>/…</w:t>
             </w:r>
             <w:r>
               <w:rPr>
@@ -11315,6 +13137,7 @@
               </w:rPr>
               <w:t xml:space="preserve">Incremental </w:t>
             </w:r>
+            <w:proofErr w:type="spellStart"/>
             <w:r>
               <w:rPr>
                 <w:rFonts w:ascii="Consolas" w:hAnsi="Consolas"/>
@@ -11323,6 +13146,7 @@
               </w:rPr>
               <w:t>fact_orders</w:t>
             </w:r>
+            <w:proofErr w:type="spellEnd"/>
             <w:r>
               <w:rPr>
                 <w:sz w:val="18"/>
@@ -11379,6 +13203,7 @@
               <w:keepNext/>
               <w:spacing w:before="40" w:after="40"/>
             </w:pPr>
+            <w:proofErr w:type="spellStart"/>
             <w:r>
               <w:rPr>
                 <w:rFonts w:ascii="Consolas" w:hAnsi="Consolas"/>
@@ -11387,11 +13212,26 @@
               </w:rPr>
               <w:t>dbt_test_sources</w:t>
             </w:r>
-            <w:r>
-              <w:rPr>
-                <w:sz w:val="18"/>
-              </w:rPr>
-              <w:t xml:space="preserve"> currently does nothing</w:t>
+            <w:proofErr w:type="spellEnd"/>
+            <w:r>
+              <w:rPr>
+                <w:sz w:val="18"/>
+              </w:rPr>
+              <w:t xml:space="preserve"> currently </w:t>
+            </w:r>
+            <w:proofErr w:type="gramStart"/>
+            <w:r>
+              <w:rPr>
+                <w:sz w:val="18"/>
+              </w:rPr>
+              <w:t>does</w:t>
+            </w:r>
+            <w:proofErr w:type="gramEnd"/>
+            <w:r>
+              <w:rPr>
+                <w:sz w:val="18"/>
+              </w:rPr>
+              <w:t xml:space="preserve"> nothing</w:t>
             </w:r>
           </w:p>
         </w:tc>
@@ -11411,6 +13251,7 @@
               </w:rPr>
               <w:t xml:space="preserve">Add </w:t>
             </w:r>
+            <w:proofErr w:type="spellStart"/>
             <w:r>
               <w:rPr>
                 <w:rFonts w:ascii="Consolas" w:hAnsi="Consolas"/>
@@ -11419,6 +13260,7 @@
               </w:rPr>
               <w:t>not_null</w:t>
             </w:r>
+            <w:proofErr w:type="spellEnd"/>
             <w:r>
               <w:rPr>
                 <w:sz w:val="18"/>
@@ -11445,30 +13287,24 @@
                 <w:color w:val="C7254E"/>
                 <w:sz w:val="16"/>
               </w:rPr>
-              <w:t xml:space="preserve">"Row </w:t>
-            </w:r>
+              <w:t>"Row ID"</w:t>
+            </w:r>
+            <w:r>
+              <w:rPr>
+                <w:sz w:val="18"/>
+              </w:rPr>
+              <w:t xml:space="preserve"> in </w:t>
+            </w:r>
+            <w:proofErr w:type="spellStart"/>
             <w:r>
               <w:rPr>
                 <w:rFonts w:ascii="Consolas" w:hAnsi="Consolas"/>
                 <w:color w:val="C7254E"/>
                 <w:sz w:val="16"/>
               </w:rPr>
-              <w:t>ID"</w:t>
-            </w:r>
-            <w:r>
-              <w:rPr>
-                <w:sz w:val="18"/>
-              </w:rPr>
-              <w:t xml:space="preserve"> in </w:t>
-            </w:r>
-            <w:r>
-              <w:rPr>
-                <w:rFonts w:ascii="Consolas" w:hAnsi="Consolas"/>
-                <w:color w:val="C7254E"/>
-                <w:sz w:val="16"/>
-              </w:rPr>
               <w:t>sources.yml</w:t>
             </w:r>
+            <w:proofErr w:type="spellEnd"/>
           </w:p>
         </w:tc>
       </w:tr>
@@ -11608,13 +13444,23 @@
               </w:rPr>
               <w:t xml:space="preserve">Customer attributes use </w:t>
             </w:r>
+            <w:proofErr w:type="gramStart"/>
             <w:r>
               <w:rPr>
                 <w:rFonts w:ascii="Consolas" w:hAnsi="Consolas"/>
                 <w:color w:val="C7254E"/>
                 <w:sz w:val="16"/>
               </w:rPr>
-              <w:t>max()</w:t>
+              <w:t>max(</w:t>
+            </w:r>
+            <w:proofErr w:type="gramEnd"/>
+            <w:r>
+              <w:rPr>
+                <w:rFonts w:ascii="Consolas" w:hAnsi="Consolas"/>
+                <w:color w:val="C7254E"/>
+                <w:sz w:val="16"/>
+              </w:rPr>
+              <w:t>)</w:t>
             </w:r>
           </w:p>
         </w:tc>
@@ -11650,7 +13496,21 @@
               <w:rPr>
                 <w:sz w:val="18"/>
               </w:rPr>
-              <w:t>SCD Type 2 with dbt snapshots</w:t>
+              <w:t xml:space="preserve">SCD Type 2 with </w:t>
+            </w:r>
+            <w:proofErr w:type="spellStart"/>
+            <w:r>
+              <w:rPr>
+                <w:sz w:val="18"/>
+              </w:rPr>
+              <w:t>dbt</w:t>
+            </w:r>
+            <w:proofErr w:type="spellEnd"/>
+            <w:r>
+              <w:rPr>
+                <w:sz w:val="18"/>
+              </w:rPr>
+              <w:t xml:space="preserve"> snapshots</w:t>
             </w:r>
           </w:p>
         </w:tc>
@@ -11675,6 +13535,7 @@
               </w:rPr>
               <w:t xml:space="preserve">Schemas named </w:t>
             </w:r>
+            <w:proofErr w:type="spellStart"/>
             <w:r>
               <w:rPr>
                 <w:rFonts w:ascii="Consolas" w:hAnsi="Consolas"/>
@@ -11683,12 +13544,14 @@
               </w:rPr>
               <w:t>main_stg</w:t>
             </w:r>
+            <w:proofErr w:type="spellEnd"/>
             <w:r>
               <w:rPr>
                 <w:sz w:val="18"/>
               </w:rPr>
               <w:t xml:space="preserve"> / </w:t>
             </w:r>
+            <w:proofErr w:type="spellStart"/>
             <w:r>
               <w:rPr>
                 <w:rFonts w:ascii="Consolas" w:hAnsi="Consolas"/>
@@ -11697,6 +13560,7 @@
               </w:rPr>
               <w:t>main_dwh</w:t>
             </w:r>
+            <w:proofErr w:type="spellEnd"/>
           </w:p>
         </w:tc>
         <w:tc>
@@ -11712,7 +13576,21 @@
               <w:rPr>
                 <w:sz w:val="18"/>
               </w:rPr>
-              <w:t>Prefix comes from dbt's default naming</w:t>
+              <w:t xml:space="preserve">Prefix comes from </w:t>
+            </w:r>
+            <w:proofErr w:type="spellStart"/>
+            <w:r>
+              <w:rPr>
+                <w:sz w:val="18"/>
+              </w:rPr>
+              <w:t>dbt's</w:t>
+            </w:r>
+            <w:proofErr w:type="spellEnd"/>
+            <w:r>
+              <w:rPr>
+                <w:sz w:val="18"/>
+              </w:rPr>
+              <w:t xml:space="preserve"> default naming</w:t>
             </w:r>
           </w:p>
         </w:tc>
@@ -11731,6 +13609,7 @@
               </w:rPr>
               <w:t xml:space="preserve">Custom </w:t>
             </w:r>
+            <w:proofErr w:type="spellStart"/>
             <w:r>
               <w:rPr>
                 <w:rFonts w:ascii="Consolas" w:hAnsi="Consolas"/>
@@ -11739,6 +13618,7 @@
               </w:rPr>
               <w:t>generate_schema_name</w:t>
             </w:r>
+            <w:proofErr w:type="spellEnd"/>
             <w:r>
               <w:rPr>
                 <w:sz w:val="18"/>
@@ -11799,11 +13679,19 @@
               <w:keepNext/>
               <w:spacing w:before="40" w:after="40"/>
             </w:pPr>
-            <w:r>
-              <w:rPr>
-                <w:sz w:val="18"/>
-              </w:rPr>
-              <w:t>CeleryExecutor or Kubernetes, with a managed warehouse</w:t>
+            <w:proofErr w:type="spellStart"/>
+            <w:r>
+              <w:rPr>
+                <w:sz w:val="18"/>
+              </w:rPr>
+              <w:t>CeleryExecutor</w:t>
+            </w:r>
+            <w:proofErr w:type="spellEnd"/>
+            <w:r>
+              <w:rPr>
+                <w:sz w:val="18"/>
+              </w:rPr>
+              <w:t xml:space="preserve"> or Kubernetes, with a managed warehouse</w:t>
             </w:r>
           </w:p>
         </w:tc>
@@ -11837,17 +13725,19 @@
             <w:pPr>
               <w:spacing w:before="40" w:after="40"/>
             </w:pPr>
-            <w:r>
-              <w:rPr>
-                <w:sz w:val="18"/>
-              </w:rPr>
-              <w:t xml:space="preserve">dbt shows warnings (5 </w:t>
-            </w:r>
-            <w:r>
-              <w:rPr>
-                <w:sz w:val="18"/>
-              </w:rPr>
-              <w:t>occurrences)</w:t>
+            <w:proofErr w:type="spellStart"/>
+            <w:r>
+              <w:rPr>
+                <w:sz w:val="18"/>
+              </w:rPr>
+              <w:t>dbt</w:t>
+            </w:r>
+            <w:proofErr w:type="spellEnd"/>
+            <w:r>
+              <w:rPr>
+                <w:sz w:val="18"/>
+              </w:rPr>
+              <w:t xml:space="preserve"> shows warnings (5 occurrences)</w:t>
             </w:r>
           </w:p>
         </w:tc>
@@ -11883,8 +13773,8 @@
       </w:pPr>
     </w:p>
     <w:sectPr>
-      <w:headerReference w:type="default" r:id="rId15"/>
-      <w:footerReference w:type="default" r:id="rId16"/>
+      <w:headerReference w:type="default" r:id="rId14"/>
+      <w:footerReference w:type="default" r:id="rId15"/>
       <w:pgSz w:w="11906" w:h="16838"/>
       <w:pgMar w:top="1247" w:right="1134" w:bottom="1134" w:left="1134" w:header="720" w:footer="720" w:gutter="0"/>
       <w:pgNumType w:start="1"/>
@@ -12018,7 +13908,23 @@
         <w:color w:val="595959"/>
         <w:sz w:val="17"/>
       </w:rPr>
-      <w:t>Superstore Data Warehouse  |  Technical Documentation</w:t>
+      <w:t xml:space="preserve">Superstore Data </w:t>
+    </w:r>
+    <w:proofErr w:type="gramStart"/>
+    <w:r>
+      <w:rPr>
+        <w:color w:val="595959"/>
+        <w:sz w:val="17"/>
+      </w:rPr>
+      <w:t>Warehouse  |</w:t>
+    </w:r>
+    <w:proofErr w:type="gramEnd"/>
+    <w:r>
+      <w:rPr>
+        <w:color w:val="595959"/>
+        <w:sz w:val="17"/>
+      </w:rPr>
+      <w:t xml:space="preserve">  Technical Documentation</w:t>
     </w:r>
   </w:p>
 </w:hdr>
@@ -12512,10 +14418,6 @@
     <w:lsdException w:name="Book Title" w:uiPriority="33" w:qFormat="1"/>
     <w:lsdException w:name="Bibliography" w:semiHidden="1" w:uiPriority="37" w:unhideWhenUsed="1"/>
     <w:lsdException w:name="TOC Heading" w:semiHidden="1" w:uiPriority="39" w:unhideWhenUsed="1" w:qFormat="1"/>
-    <w:lsdException w:name="Grid Table Light" w:semiHidden="1" w:unhideWhenUsed="1"/>
-    <w:lsdException w:name="Grid Table 1 Light" w:semiHidden="1" w:unhideWhenUsed="1"/>
-    <w:lsdException w:name="Grid Table 2" w:semiHidden="1" w:unhideWhenUsed="1"/>
-    <w:lsdException w:name="Grid Table 3" w:semiHidden="1" w:unhideWhenUsed="1"/>
     <w:lsdException w:name="Grid Table 4" w:uiPriority="49"/>
     <w:lsdException w:name="Grid Table 5 Dark" w:uiPriority="50"/>
     <w:lsdException w:name="Grid Table 6 Colorful" w:uiPriority="51"/>
@@ -23972,7 +25874,7 @@
 </file>
 
 <file path=customXml/itemProps1.xml><?xml version="1.0" encoding="utf-8"?>
-<ds:datastoreItem xmlns:ds="http://schemas.openxmlformats.org/officeDocument/2006/customXml" ds:itemID="{FAD7A0E4-A22F-4DA0-A0BA-0E9331263DE7}">
+<ds:datastoreItem xmlns:ds="http://schemas.openxmlformats.org/officeDocument/2006/customXml" ds:itemID="{C8CE79F8-BA21-4121-8367-9379F97D1F5F}">
   <ds:schemaRefs>
     <ds:schemaRef ds:uri="http://schemas.openxmlformats.org/officeDocument/2006/bibliography"/>
   </ds:schemaRefs>

</xml_diff>